<commit_message>
Revise the plain-language report with the corridor profiles and the recent findings
Second edition of Survey_Matrices_Car_Bus_Rail_Report.docx: adds Part E
(demand profiles along the corridor, total and transit) and Part F
(calibrated survey vs ticketing profile comparison, the local-vs-intercity
reading of the ticketing coverage gap and the refinement it implies, GEH and
shape tests of the profiles against the cellular hybrid, and the
recommendation to report the 7:00-8:00 peak hour as 40% of the three-hour
matrix); the summary, caveats and file inventory are updated accordingly.

Co-Authored-By: Claude Fable 5.1 <noreply@anthropic.com>
Claude-Session: https://claude.ai/code/session_01Sb4aWx51dpfvrRANy91cHR
</commit_message>
<xml_diff>
--- a/Survey_Matrices_Car_Bus_Rail_Report.docx
+++ b/Survey_Matrices_Car_Bus_Rail_Report.docx
@@ -88,7 +88,7 @@
           <w:sz w:val="22"/>
           <w:szCs w:val="22"/>
         </w:rPr>
-        <w:t xml:space="preserve">THS_2017_cosine_GEH_tests, THS_2017_KS_tests, THS_2017_MSSIM_tests, THS_2017_two_mode_matrix, THS_2017_three_mode_2022</w:t>
+        <w:t xml:space="preserve">THS_2017_cosine_GEH_tests, THS_2017_KS_tests, THS_2017_MSSIM_tests, THS_2017_two_mode_matrix, THS_2017_three_mode_2022, Corridor_flow_profile_survey_2022, Corridor_profile_hybrid_vs_ticketing, Corridor_profile_hybrid_vs_survey_tests</w:t>
       </w:r>
     </w:p>
     <w:p>
@@ -112,6 +112,29 @@
           <w:szCs w:val="22"/>
         </w:rPr>
         <w:t xml:space="preserve">Output/ths2017/tests/, Output/ths2017/two_mode/, Output/ths2017/three_mode_2022/</w:t>
+      </w:r>
+    </w:p>
+    <w:p>
+      <w:pPr>
+        <w:spacing w:after="120" w:line="276"/>
+      </w:pPr>
+      <w:r>
+        <w:rPr>
+          <w:rFonts w:ascii="Calibri" w:cs="Calibri" w:eastAsia="Calibri" w:hAnsi="Calibri"/>
+          <w:b/>
+          <w:bCs/>
+          <w:sz w:val="22"/>
+          <w:szCs w:val="22"/>
+        </w:rPr>
+        <w:t xml:space="preserve">Revision: </w:t>
+      </w:r>
+      <w:r>
+        <w:rPr>
+          <w:rFonts w:ascii="Calibri" w:cs="Calibri" w:eastAsia="Calibri" w:hAnsi="Calibri"/>
+          <w:sz w:val="22"/>
+          <w:szCs w:val="22"/>
+        </w:rPr>
+        <w:t xml:space="preserve">second edition, adding the corridor demand profiles, the comparison with the ticketing-based profile, the tests against the cellular hybrid, and the one-hour reporting recommendation.</w:t>
       </w:r>
     </w:p>
     <w:p>
@@ -275,6 +298,34 @@
           <w:szCs w:val="22"/>
         </w:rPr>
         <w:t xml:space="preserve">That matrix moved from its 2018 base year to 2022 and split into three matrices: car, bus and rail.</w:t>
+      </w:r>
+    </w:p>
+    <w:p>
+      <w:pPr>
+        <w:pStyle w:val="ListParagraph"/>
+        <w:numPr>
+          <w:ilvl w:val="0"/>
+          <w:numId w:val="2"/>
+        </w:numPr>
+        <w:spacing w:after="80" w:line="276"/>
+      </w:pPr>
+      <w:r>
+        <w:rPr>
+          <w:rFonts w:ascii="Calibri" w:cs="Calibri" w:eastAsia="Calibri" w:hAnsi="Calibri"/>
+          <w:b/>
+          <w:bCs/>
+          <w:sz w:val="22"/>
+          <w:szCs w:val="22"/>
+        </w:rPr>
+        <w:t xml:space="preserve">Corridor profiles. </w:t>
+      </w:r>
+      <w:r>
+        <w:rPr>
+          <w:rFonts w:ascii="Calibri" w:cs="Calibri" w:eastAsia="Calibri" w:hAnsi="Calibri"/>
+          <w:sz w:val="22"/>
+          <w:szCs w:val="22"/>
+        </w:rPr>
+        <w:t xml:space="preserve">Directional demand profiles along the LRT corridor for the total and the transit-only matrices, compared with the earlier ticketing-based profile and tested against the cellular hybrid.</w:t>
       </w:r>
     </w:p>
     <w:p>
@@ -966,6 +1017,118 @@
           <w:szCs w:val="22"/>
         </w:rPr>
         <w:t xml:space="preserve">Car grows 5.5 % on population and employment growth; bus is anchored to 2022 ticketing counts; rail follows the national ridership drop. Trip rates per person are held at the 2018 survey level.</w:t>
+      </w:r>
+    </w:p>
+    <w:p>
+      <w:pPr>
+        <w:pStyle w:val="ListParagraph"/>
+        <w:numPr>
+          <w:ilvl w:val="0"/>
+          <w:numId w:val="2"/>
+        </w:numPr>
+        <w:spacing w:after="80" w:line="276"/>
+      </w:pPr>
+      <w:r>
+        <w:rPr>
+          <w:rFonts w:ascii="Calibri" w:cs="Calibri" w:eastAsia="Calibri" w:hAnsi="Calibri"/>
+          <w:b/>
+          <w:bCs/>
+          <w:sz w:val="22"/>
+          <w:szCs w:val="22"/>
+        </w:rPr>
+        <w:t xml:space="preserve">Corridor profiles. </w:t>
+      </w:r>
+      <w:r>
+        <w:rPr>
+          <w:rFonts w:ascii="Calibri" w:cs="Calibri" w:eastAsia="Calibri" w:hAnsi="Calibri"/>
+          <w:sz w:val="22"/>
+          <w:szCs w:val="22"/>
+        </w:rPr>
+        <w:t xml:space="preserve">The busiest link is Bat Galim – Kiryat Eliezer in both directions (6,900 / 6,500 trips in three hours). Transit is 30–45 % of link flow on the Haifa segment. Towards Nazareth the calibrated bus profile matches the ticketing profile within about 10 %; towards Tirat Carmel the ticketing profile is about double, because ticketing places journeys at transfer hubs and carries the Nazareth intercity market that the coverage guard left at survey level.</w:t>
+      </w:r>
+    </w:p>
+    <w:p>
+      <w:pPr>
+        <w:pStyle w:val="ListParagraph"/>
+        <w:numPr>
+          <w:ilvl w:val="0"/>
+          <w:numId w:val="2"/>
+        </w:numPr>
+        <w:spacing w:after="80" w:line="276"/>
+      </w:pPr>
+      <w:r>
+        <w:rPr>
+          <w:rFonts w:ascii="Calibri" w:cs="Calibri" w:eastAsia="Calibri" w:hAnsi="Calibri"/>
+          <w:b/>
+          <w:bCs/>
+          <w:sz w:val="22"/>
+          <w:szCs w:val="22"/>
+        </w:rPr>
+        <w:t xml:space="preserve">A refinement to make. </w:t>
+      </w:r>
+      <w:r>
+        <w:rPr>
+          <w:rFonts w:ascii="Calibri" w:cs="Calibri" w:eastAsia="Calibri" w:hAnsi="Calibri"/>
+          <w:sz w:val="22"/>
+          <w:szCs w:val="22"/>
+        </w:rPr>
+        <w:t xml:space="preserve">The ticketing shortfall in the Nazareth-area and similar superzones is a local-trip gap: ticketing sees 8 % of the survey's local bus trips there but 74 % of its trips to Haifa. The coverage rule should be applied separately to local and intercity trips; this refinement is recorded but not yet run.</w:t>
+      </w:r>
+    </w:p>
+    <w:p>
+      <w:pPr>
+        <w:pStyle w:val="ListParagraph"/>
+        <w:numPr>
+          <w:ilvl w:val="0"/>
+          <w:numId w:val="2"/>
+        </w:numPr>
+        <w:spacing w:after="80" w:line="276"/>
+      </w:pPr>
+      <w:r>
+        <w:rPr>
+          <w:rFonts w:ascii="Calibri" w:cs="Calibri" w:eastAsia="Calibri" w:hAnsi="Calibri"/>
+          <w:b/>
+          <w:bCs/>
+          <w:sz w:val="22"/>
+          <w:szCs w:val="22"/>
+        </w:rPr>
+        <w:t xml:space="preserve">Hybrid versus survey-only. </w:t>
+      </w:r>
+      <w:r>
+        <w:rPr>
+          <w:rFonts w:ascii="Calibri" w:cs="Calibri" w:eastAsia="Calibri" w:hAnsi="Calibri"/>
+          <w:sz w:val="22"/>
+          <w:szCs w:val="22"/>
+        </w:rPr>
+        <w:t xml:space="preserve">Against the cellular hybrid, the survey-only corridor profiles have the same shape along the line within survey noise. The one clear difference is transit towards Nazareth, where the hybrid carries 35–50 % less along the Haifa segment.</w:t>
+      </w:r>
+    </w:p>
+    <w:p>
+      <w:pPr>
+        <w:pStyle w:val="ListParagraph"/>
+        <w:numPr>
+          <w:ilvl w:val="0"/>
+          <w:numId w:val="2"/>
+        </w:numPr>
+        <w:spacing w:after="80" w:line="276"/>
+      </w:pPr>
+      <w:r>
+        <w:rPr>
+          <w:rFonts w:ascii="Calibri" w:cs="Calibri" w:eastAsia="Calibri" w:hAnsi="Calibri"/>
+          <w:b/>
+          <w:bCs/>
+          <w:sz w:val="22"/>
+          <w:szCs w:val="22"/>
+        </w:rPr>
+        <w:t xml:space="preserve">Reporting one hour. </w:t>
+      </w:r>
+      <w:r>
+        <w:rPr>
+          <w:rFonts w:ascii="Calibri" w:cs="Calibri" w:eastAsia="Calibri" w:hAnsi="Calibri"/>
+          <w:sz w:val="22"/>
+          <w:szCs w:val="22"/>
+        </w:rPr>
+        <w:t xml:space="preserve">Report the peak hour (7:00–8:00) as 40 % of the three-hour matrix, the share the measured sources give; the survey's own departure hours are too peaked to use.</w:t>
       </w:r>
     </w:p>
     <w:p>
@@ -11263,7 +11426,697 @@
         <w:rPr>
           <w:rFonts w:ascii="Calibri" w:cs="Calibri" w:eastAsia="Calibri" w:hAnsi="Calibri"/>
         </w:rPr>
-        <w:t xml:space="preserve">7. What to keep in mind</w:t>
+        <w:t xml:space="preserve">7. Part E — demand profiles along the corridor</w:t>
+      </w:r>
+    </w:p>
+    <w:p>
+      <w:pPr>
+        <w:pStyle w:val="Heading2"/>
+        <w:spacing w:after="120" w:before="280"/>
+      </w:pPr>
+      <w:r>
+        <w:rPr>
+          <w:rFonts w:ascii="Calibri" w:cs="Calibri" w:eastAsia="Calibri" w:hAnsi="Calibri"/>
+        </w:rPr>
+        <w:t xml:space="preserve">7.1 How a profile is built</w:t>
+      </w:r>
+    </w:p>
+    <w:p>
+      <w:pPr>
+        <w:spacing w:after="120" w:line="276"/>
+      </w:pPr>
+      <w:r>
+        <w:rPr>
+          <w:rFonts w:ascii="Calibri" w:cs="Calibri" w:eastAsia="Calibri" w:hAnsi="Calibri"/>
+          <w:sz w:val="22"/>
+          <w:szCs w:val="22"/>
+        </w:rPr>
+        <w:t xml:space="preserve">The corridor is described as a line of 18 named areas from Tirat Carmel to Nazareth (the corridor areas of the sub-area file in code order, leaving out three small areas that the earlier profile had also left out). Every trip with both ends on the line is added to every link it crosses between its origin and its destination, in its direction of travel. The result is the number of trips crossing each link in each direction during the three morning hours. Direction 1 → 23 runs from Tirat Carmel towards Nazareth, 23 → 1 the other way. This is the same construction used earlier for the cellular hybrid, so the profiles can be laid over each other.</w:t>
+      </w:r>
+    </w:p>
+    <w:p>
+      <w:pPr>
+        <w:spacing w:after="120" w:line="276"/>
+      </w:pPr>
+      <w:r>
+        <w:rPr>
+          <w:rFonts w:ascii="Calibri" w:cs="Calibri" w:eastAsia="Calibri" w:hAnsi="Calibri"/>
+          <w:sz w:val="22"/>
+          <w:szCs w:val="22"/>
+        </w:rPr>
+        <w:t xml:space="preserve">Two profiles were built from the 2022 three-mode matrices: the total (car + bus + rail) and transit only (bus, including shared taxis, plus rail).</w:t>
+      </w:r>
+    </w:p>
+    <w:p>
+      <w:pPr>
+        <w:pStyle w:val="Heading2"/>
+        <w:spacing w:after="120" w:before="280"/>
+      </w:pPr>
+      <w:r>
+        <w:rPr>
+          <w:rFonts w:ascii="Calibri" w:cs="Calibri" w:eastAsia="Calibri" w:hAnsi="Calibri"/>
+        </w:rPr>
+        <w:t xml:space="preserve">7.2 Results</w:t>
+      </w:r>
+    </w:p>
+    <w:tbl>
+      <w:tblPr>
+        <w:tblW w:type="dxa" w:w="9026"/>
+        <w:tblBorders>
+          <w:top w:val="single" w:color="auto" w:sz="4"/>
+          <w:left w:val="single" w:color="auto" w:sz="4"/>
+          <w:bottom w:val="single" w:color="auto" w:sz="4"/>
+          <w:right w:val="single" w:color="auto" w:sz="4"/>
+          <w:insideH w:val="single" w:color="auto" w:sz="4"/>
+          <w:insideV w:val="single" w:color="auto" w:sz="4"/>
+        </w:tblBorders>
+      </w:tblPr>
+      <w:tblGrid>
+        <w:gridCol w:w="3410"/>
+        <w:gridCol w:w="2808"/>
+        <w:gridCol w:w="2808"/>
+      </w:tblGrid>
+      <w:tr>
+        <w:trPr>
+          <w:tblHeader/>
+        </w:trPr>
+        <w:tc>
+          <w:tcPr>
+            <w:tcW w:type="dxa" w:w="3410"/>
+            <w:shd w:fill="e8f0fb" w:color="auto" w:val="clear"/>
+            <w:tcMar>
+              <w:top w:type="dxa" w:w="60"/>
+              <w:left w:type="dxa" w:w="90"/>
+              <w:bottom w:type="dxa" w:w="60"/>
+              <w:right w:type="dxa" w:w="90"/>
+            </w:tcMar>
+          </w:tcPr>
+          <w:p>
+            <w:pPr>
+              <w:spacing w:after="0" w:line="240"/>
+              <w:jc w:val="left"/>
+            </w:pPr>
+            <w:r>
+              <w:rPr>
+                <w:rFonts w:ascii="Calibri" w:cs="Calibri" w:eastAsia="Calibri" w:hAnsi="Calibri"/>
+                <w:b/>
+                <w:bCs/>
+                <w:sz w:val="19"/>
+                <w:szCs w:val="19"/>
+              </w:rPr>
+              <w:t xml:space="preserve"/>
+            </w:r>
+          </w:p>
+        </w:tc>
+        <w:tc>
+          <w:tcPr>
+            <w:tcW w:type="dxa" w:w="2808"/>
+            <w:shd w:fill="e8f0fb" w:color="auto" w:val="clear"/>
+            <w:tcMar>
+              <w:top w:type="dxa" w:w="60"/>
+              <w:left w:type="dxa" w:w="90"/>
+              <w:bottom w:type="dxa" w:w="60"/>
+              <w:right w:type="dxa" w:w="90"/>
+            </w:tcMar>
+          </w:tcPr>
+          <w:p>
+            <w:pPr>
+              <w:spacing w:after="0" w:line="240"/>
+              <w:jc w:val="center"/>
+            </w:pPr>
+            <w:r>
+              <w:rPr>
+                <w:rFonts w:ascii="Calibri" w:cs="Calibri" w:eastAsia="Calibri" w:hAnsi="Calibri"/>
+                <w:b/>
+                <w:bCs/>
+                <w:sz w:val="19"/>
+                <w:szCs w:val="19"/>
+              </w:rPr>
+              <w:t xml:space="preserve">Survey-only 2022 (this report)</w:t>
+            </w:r>
+          </w:p>
+        </w:tc>
+        <w:tc>
+          <w:tcPr>
+            <w:tcW w:type="dxa" w:w="2808"/>
+            <w:shd w:fill="e8f0fb" w:color="auto" w:val="clear"/>
+            <w:tcMar>
+              <w:top w:type="dxa" w:w="60"/>
+              <w:left w:type="dxa" w:w="90"/>
+              <w:bottom w:type="dxa" w:w="60"/>
+              <w:right w:type="dxa" w:w="90"/>
+            </w:tcMar>
+          </w:tcPr>
+          <w:p>
+            <w:pPr>
+              <w:spacing w:after="0" w:line="240"/>
+              <w:jc w:val="center"/>
+            </w:pPr>
+            <w:r>
+              <w:rPr>
+                <w:rFonts w:ascii="Calibri" w:cs="Calibri" w:eastAsia="Calibri" w:hAnsi="Calibri"/>
+                <w:b/>
+                <w:bCs/>
+                <w:sz w:val="19"/>
+                <w:szCs w:val="19"/>
+              </w:rPr>
+              <w:t xml:space="preserve">Earlier hybrid-based 2022</w:t>
+            </w:r>
+          </w:p>
+        </w:tc>
+      </w:tr>
+      <w:tr>
+        <w:tc>
+          <w:tcPr>
+            <w:tcW w:type="dxa" w:w="3410"/>
+            <w:tcMar>
+              <w:top w:type="dxa" w:w="60"/>
+              <w:left w:type="dxa" w:w="90"/>
+              <w:bottom w:type="dxa" w:w="60"/>
+              <w:right w:type="dxa" w:w="90"/>
+            </w:tcMar>
+          </w:tcPr>
+          <w:p>
+            <w:pPr>
+              <w:spacing w:after="0" w:line="240"/>
+              <w:jc w:val="left"/>
+            </w:pPr>
+            <w:r>
+              <w:rPr>
+                <w:rFonts w:ascii="Calibri" w:cs="Calibri" w:eastAsia="Calibri" w:hAnsi="Calibri"/>
+                <w:b w:val="false"/>
+                <w:bCs w:val="false"/>
+                <w:sz w:val="19"/>
+                <w:szCs w:val="19"/>
+              </w:rPr>
+              <w:t xml:space="preserve">Corridor-internal trips, total</w:t>
+            </w:r>
+          </w:p>
+        </w:tc>
+        <w:tc>
+          <w:tcPr>
+            <w:tcW w:type="dxa" w:w="2808"/>
+            <w:tcMar>
+              <w:top w:type="dxa" w:w="60"/>
+              <w:left w:type="dxa" w:w="90"/>
+              <w:bottom w:type="dxa" w:w="60"/>
+              <w:right w:type="dxa" w:w="90"/>
+            </w:tcMar>
+          </w:tcPr>
+          <w:p>
+            <w:pPr>
+              <w:spacing w:after="0" w:line="240"/>
+              <w:jc w:val="left"/>
+            </w:pPr>
+            <w:r>
+              <w:rPr>
+                <w:rFonts w:ascii="Calibri" w:cs="Calibri" w:eastAsia="Calibri" w:hAnsi="Calibri"/>
+                <w:b w:val="false"/>
+                <w:bCs w:val="false"/>
+                <w:sz w:val="19"/>
+                <w:szCs w:val="19"/>
+              </w:rPr>
+              <w:t xml:space="preserve">69,655</w:t>
+            </w:r>
+          </w:p>
+        </w:tc>
+        <w:tc>
+          <w:tcPr>
+            <w:tcW w:type="dxa" w:w="2808"/>
+            <w:tcMar>
+              <w:top w:type="dxa" w:w="60"/>
+              <w:left w:type="dxa" w:w="90"/>
+              <w:bottom w:type="dxa" w:w="60"/>
+              <w:right w:type="dxa" w:w="90"/>
+            </w:tcMar>
+          </w:tcPr>
+          <w:p>
+            <w:pPr>
+              <w:spacing w:after="0" w:line="240"/>
+              <w:jc w:val="left"/>
+            </w:pPr>
+            <w:r>
+              <w:rPr>
+                <w:rFonts w:ascii="Calibri" w:cs="Calibri" w:eastAsia="Calibri" w:hAnsi="Calibri"/>
+                <w:b w:val="false"/>
+                <w:bCs w:val="false"/>
+                <w:sz w:val="19"/>
+                <w:szCs w:val="19"/>
+              </w:rPr>
+              <w:t xml:space="preserve">101,004</w:t>
+            </w:r>
+          </w:p>
+        </w:tc>
+      </w:tr>
+      <w:tr>
+        <w:tc>
+          <w:tcPr>
+            <w:tcW w:type="dxa" w:w="3410"/>
+            <w:tcMar>
+              <w:top w:type="dxa" w:w="60"/>
+              <w:left w:type="dxa" w:w="90"/>
+              <w:bottom w:type="dxa" w:w="60"/>
+              <w:right w:type="dxa" w:w="90"/>
+            </w:tcMar>
+          </w:tcPr>
+          <w:p>
+            <w:pPr>
+              <w:spacing w:after="0" w:line="240"/>
+              <w:jc w:val="left"/>
+            </w:pPr>
+            <w:r>
+              <w:rPr>
+                <w:rFonts w:ascii="Calibri" w:cs="Calibri" w:eastAsia="Calibri" w:hAnsi="Calibri"/>
+                <w:b w:val="false"/>
+                <w:bCs w:val="false"/>
+                <w:sz w:val="19"/>
+                <w:szCs w:val="19"/>
+              </w:rPr>
+              <w:t xml:space="preserve">Busiest link, total</w:t>
+            </w:r>
+          </w:p>
+        </w:tc>
+        <w:tc>
+          <w:tcPr>
+            <w:tcW w:type="dxa" w:w="2808"/>
+            <w:tcMar>
+              <w:top w:type="dxa" w:w="60"/>
+              <w:left w:type="dxa" w:w="90"/>
+              <w:bottom w:type="dxa" w:w="60"/>
+              <w:right w:type="dxa" w:w="90"/>
+            </w:tcMar>
+          </w:tcPr>
+          <w:p>
+            <w:pPr>
+              <w:spacing w:after="0" w:line="240"/>
+              <w:jc w:val="left"/>
+            </w:pPr>
+            <w:r>
+              <w:rPr>
+                <w:rFonts w:ascii="Calibri" w:cs="Calibri" w:eastAsia="Calibri" w:hAnsi="Calibri"/>
+                <w:b w:val="false"/>
+                <w:bCs w:val="false"/>
+                <w:sz w:val="19"/>
+                <w:szCs w:val="19"/>
+              </w:rPr>
+              <w:t xml:space="preserve">Bat Galim – Kiryat Eliezer</w:t>
+            </w:r>
+          </w:p>
+        </w:tc>
+        <w:tc>
+          <w:tcPr>
+            <w:tcW w:type="dxa" w:w="2808"/>
+            <w:tcMar>
+              <w:top w:type="dxa" w:w="60"/>
+              <w:left w:type="dxa" w:w="90"/>
+              <w:bottom w:type="dxa" w:w="60"/>
+              <w:right w:type="dxa" w:w="90"/>
+            </w:tcMar>
+          </w:tcPr>
+          <w:p>
+            <w:pPr>
+              <w:spacing w:after="0" w:line="240"/>
+              <w:jc w:val="left"/>
+            </w:pPr>
+            <w:r>
+              <w:rPr>
+                <w:rFonts w:ascii="Calibri" w:cs="Calibri" w:eastAsia="Calibri" w:hAnsi="Calibri"/>
+                <w:b w:val="false"/>
+                <w:bCs w:val="false"/>
+                <w:sz w:val="19"/>
+                <w:szCs w:val="19"/>
+              </w:rPr>
+              <w:t xml:space="preserve">same</w:t>
+            </w:r>
+          </w:p>
+        </w:tc>
+      </w:tr>
+      <w:tr>
+        <w:tc>
+          <w:tcPr>
+            <w:tcW w:type="dxa" w:w="3410"/>
+            <w:tcMar>
+              <w:top w:type="dxa" w:w="60"/>
+              <w:left w:type="dxa" w:w="90"/>
+              <w:bottom w:type="dxa" w:w="60"/>
+              <w:right w:type="dxa" w:w="90"/>
+            </w:tcMar>
+          </w:tcPr>
+          <w:p>
+            <w:pPr>
+              <w:spacing w:after="0" w:line="240"/>
+              <w:jc w:val="left"/>
+            </w:pPr>
+            <w:r>
+              <w:rPr>
+                <w:rFonts w:ascii="Calibri" w:cs="Calibri" w:eastAsia="Calibri" w:hAnsi="Calibri"/>
+                <w:b w:val="false"/>
+                <w:bCs w:val="false"/>
+                <w:sz w:val="19"/>
+                <w:szCs w:val="19"/>
+              </w:rPr>
+              <w:t xml:space="preserve">Busiest link, towards Nazareth / towards Tirat Carmel</w:t>
+            </w:r>
+          </w:p>
+        </w:tc>
+        <w:tc>
+          <w:tcPr>
+            <w:tcW w:type="dxa" w:w="2808"/>
+            <w:tcMar>
+              <w:top w:type="dxa" w:w="60"/>
+              <w:left w:type="dxa" w:w="90"/>
+              <w:bottom w:type="dxa" w:w="60"/>
+              <w:right w:type="dxa" w:w="90"/>
+            </w:tcMar>
+          </w:tcPr>
+          <w:p>
+            <w:pPr>
+              <w:spacing w:after="0" w:line="240"/>
+              <w:jc w:val="left"/>
+            </w:pPr>
+            <w:r>
+              <w:rPr>
+                <w:rFonts w:ascii="Calibri" w:cs="Calibri" w:eastAsia="Calibri" w:hAnsi="Calibri"/>
+                <w:b w:val="false"/>
+                <w:bCs w:val="false"/>
+                <w:sz w:val="19"/>
+                <w:szCs w:val="19"/>
+              </w:rPr>
+              <w:t xml:space="preserve">6,862 / 6,458</w:t>
+            </w:r>
+          </w:p>
+        </w:tc>
+        <w:tc>
+          <w:tcPr>
+            <w:tcW w:type="dxa" w:w="2808"/>
+            <w:tcMar>
+              <w:top w:type="dxa" w:w="60"/>
+              <w:left w:type="dxa" w:w="90"/>
+              <w:bottom w:type="dxa" w:w="60"/>
+              <w:right w:type="dxa" w:w="90"/>
+            </w:tcMar>
+          </w:tcPr>
+          <w:p>
+            <w:pPr>
+              <w:spacing w:after="0" w:line="240"/>
+              <w:jc w:val="left"/>
+            </w:pPr>
+            <w:r>
+              <w:rPr>
+                <w:rFonts w:ascii="Calibri" w:cs="Calibri" w:eastAsia="Calibri" w:hAnsi="Calibri"/>
+                <w:b w:val="false"/>
+                <w:bCs w:val="false"/>
+                <w:sz w:val="19"/>
+                <w:szCs w:val="19"/>
+              </w:rPr>
+              <w:t xml:space="preserve">7,671 / 7,576</w:t>
+            </w:r>
+          </w:p>
+        </w:tc>
+      </w:tr>
+      <w:tr>
+        <w:tc>
+          <w:tcPr>
+            <w:tcW w:type="dxa" w:w="3410"/>
+            <w:tcMar>
+              <w:top w:type="dxa" w:w="60"/>
+              <w:left w:type="dxa" w:w="90"/>
+              <w:bottom w:type="dxa" w:w="60"/>
+              <w:right w:type="dxa" w:w="90"/>
+            </w:tcMar>
+          </w:tcPr>
+          <w:p>
+            <w:pPr>
+              <w:spacing w:after="0" w:line="240"/>
+              <w:jc w:val="left"/>
+            </w:pPr>
+            <w:r>
+              <w:rPr>
+                <w:rFonts w:ascii="Calibri" w:cs="Calibri" w:eastAsia="Calibri" w:hAnsi="Calibri"/>
+                <w:b w:val="false"/>
+                <w:bCs w:val="false"/>
+                <w:sz w:val="19"/>
+                <w:szCs w:val="19"/>
+              </w:rPr>
+              <w:t xml:space="preserve">Corridor-internal trips, transit</w:t>
+            </w:r>
+          </w:p>
+        </w:tc>
+        <w:tc>
+          <w:tcPr>
+            <w:tcW w:type="dxa" w:w="2808"/>
+            <w:tcMar>
+              <w:top w:type="dxa" w:w="60"/>
+              <w:left w:type="dxa" w:w="90"/>
+              <w:bottom w:type="dxa" w:w="60"/>
+              <w:right w:type="dxa" w:w="90"/>
+            </w:tcMar>
+          </w:tcPr>
+          <w:p>
+            <w:pPr>
+              <w:spacing w:after="0" w:line="240"/>
+              <w:jc w:val="left"/>
+            </w:pPr>
+            <w:r>
+              <w:rPr>
+                <w:rFonts w:ascii="Calibri" w:cs="Calibri" w:eastAsia="Calibri" w:hAnsi="Calibri"/>
+                <w:b w:val="false"/>
+                <w:bCs w:val="false"/>
+                <w:sz w:val="19"/>
+                <w:szCs w:val="19"/>
+              </w:rPr>
+              <w:t xml:space="preserve">10,770</w:t>
+            </w:r>
+          </w:p>
+        </w:tc>
+        <w:tc>
+          <w:tcPr>
+            <w:tcW w:type="dxa" w:w="2808"/>
+            <w:tcMar>
+              <w:top w:type="dxa" w:w="60"/>
+              <w:left w:type="dxa" w:w="90"/>
+              <w:bottom w:type="dxa" w:w="60"/>
+              <w:right w:type="dxa" w:w="90"/>
+            </w:tcMar>
+          </w:tcPr>
+          <w:p>
+            <w:pPr>
+              <w:spacing w:after="0" w:line="240"/>
+              <w:jc w:val="left"/>
+            </w:pPr>
+            <w:r>
+              <w:rPr>
+                <w:rFonts w:ascii="Calibri" w:cs="Calibri" w:eastAsia="Calibri" w:hAnsi="Calibri"/>
+                <w:b w:val="false"/>
+                <w:bCs w:val="false"/>
+                <w:sz w:val="19"/>
+                <w:szCs w:val="19"/>
+              </w:rPr>
+              <w:t xml:space="preserve">—</w:t>
+            </w:r>
+          </w:p>
+        </w:tc>
+      </w:tr>
+      <w:tr>
+        <w:tc>
+          <w:tcPr>
+            <w:tcW w:type="dxa" w:w="3410"/>
+            <w:tcMar>
+              <w:top w:type="dxa" w:w="60"/>
+              <w:left w:type="dxa" w:w="90"/>
+              <w:bottom w:type="dxa" w:w="60"/>
+              <w:right w:type="dxa" w:w="90"/>
+            </w:tcMar>
+          </w:tcPr>
+          <w:p>
+            <w:pPr>
+              <w:spacing w:after="0" w:line="240"/>
+              <w:jc w:val="left"/>
+            </w:pPr>
+            <w:r>
+              <w:rPr>
+                <w:rFonts w:ascii="Calibri" w:cs="Calibri" w:eastAsia="Calibri" w:hAnsi="Calibri"/>
+                <w:b w:val="false"/>
+                <w:bCs w:val="false"/>
+                <w:sz w:val="19"/>
+                <w:szCs w:val="19"/>
+              </w:rPr>
+              <w:t xml:space="preserve">Busiest link, transit</w:t>
+            </w:r>
+          </w:p>
+        </w:tc>
+        <w:tc>
+          <w:tcPr>
+            <w:tcW w:type="dxa" w:w="2808"/>
+            <w:tcMar>
+              <w:top w:type="dxa" w:w="60"/>
+              <w:left w:type="dxa" w:w="90"/>
+              <w:bottom w:type="dxa" w:w="60"/>
+              <w:right w:type="dxa" w:w="90"/>
+            </w:tcMar>
+          </w:tcPr>
+          <w:p>
+            <w:pPr>
+              <w:spacing w:after="0" w:line="240"/>
+              <w:jc w:val="left"/>
+            </w:pPr>
+            <w:r>
+              <w:rPr>
+                <w:rFonts w:ascii="Calibri" w:cs="Calibri" w:eastAsia="Calibri" w:hAnsi="Calibri"/>
+                <w:b w:val="false"/>
+                <w:bCs w:val="false"/>
+                <w:sz w:val="19"/>
+                <w:szCs w:val="19"/>
+              </w:rPr>
+              <w:t xml:space="preserve">Ein Hayam – Bat Galim, 2,966 towards Nazareth</w:t>
+            </w:r>
+          </w:p>
+        </w:tc>
+        <w:tc>
+          <w:tcPr>
+            <w:tcW w:type="dxa" w:w="2808"/>
+            <w:tcMar>
+              <w:top w:type="dxa" w:w="60"/>
+              <w:left w:type="dxa" w:w="90"/>
+              <w:bottom w:type="dxa" w:w="60"/>
+              <w:right w:type="dxa" w:w="90"/>
+            </w:tcMar>
+          </w:tcPr>
+          <w:p>
+            <w:pPr>
+              <w:spacing w:after="0" w:line="240"/>
+              <w:jc w:val="left"/>
+            </w:pPr>
+            <w:r>
+              <w:rPr>
+                <w:rFonts w:ascii="Calibri" w:cs="Calibri" w:eastAsia="Calibri" w:hAnsi="Calibri"/>
+                <w:b w:val="false"/>
+                <w:bCs w:val="false"/>
+                <w:sz w:val="19"/>
+                <w:szCs w:val="19"/>
+              </w:rPr>
+              <w:t xml:space="preserve">Bat Galim – Kiryat Eliezer, 2,584 towards Tirat Carmel (ticketing-based)</w:t>
+            </w:r>
+          </w:p>
+        </w:tc>
+      </w:tr>
+    </w:tbl>
+    <w:p>
+      <w:pPr>
+        <w:spacing w:after="120"/>
+      </w:pPr>
+    </w:p>
+    <w:p>
+      <w:pPr>
+        <w:spacing w:after="120" w:line="276"/>
+      </w:pPr>
+      <w:r>
+        <w:rPr>
+          <w:rFonts w:ascii="Calibri" w:cs="Calibri" w:eastAsia="Calibri" w:hAnsi="Calibri"/>
+          <w:sz w:val="22"/>
+          <w:szCs w:val="22"/>
+        </w:rPr>
+        <w:t xml:space="preserve">On the Haifa segment the total profile matches the earlier one closely; the Krayot-to-Nazareth segment carries less in both directions. The lower internal total is mostly because the earlier matrix included walking and other modes, which the three-mode set leaves out. Transit is 30 to 45 % of the link flow on the Haifa segment although it is only 15 % of the corridor's trips: transit trips are longer, so they cross more links and weigh more in a link profile than in a trip count.</w:t>
+      </w:r>
+    </w:p>
+    <w:p>
+      <w:pPr>
+        <w:spacing w:after="0" w:before="120"/>
+        <w:jc w:val="center"/>
+      </w:pPr>
+      <w:r>
+        <w:drawing>
+          <wp:inline distT="0" distB="0" distL="0" distR="0">
+            <wp:extent cx="5762625" cy="2867025"/>
+            <wp:effectExtent t="0" r="0" b="0" l="0"/>
+            <wp:docPr id="1" name="" descr="" title=""/>
+            <wp:cNvGraphicFramePr>
+              <a:graphicFrameLocks xmlns:a="http://schemas.openxmlformats.org/drawingml/2006/main" noChangeAspect="1"/>
+            </wp:cNvGraphicFramePr>
+            <a:graphic xmlns:a="http://schemas.openxmlformats.org/drawingml/2006/main">
+              <a:graphicData uri="http://schemas.openxmlformats.org/drawingml/2006/picture">
+                <pic:pic xmlns:pic="http://schemas.openxmlformats.org/drawingml/2006/picture">
+                  <pic:nvPicPr>
+                    <pic:cNvPr id="0" name="" descr=""/>
+                    <pic:cNvPicPr>
+                      <a:picLocks noChangeAspect="1" noChangeArrowheads="1"/>
+                    </pic:cNvPicPr>
+                  </pic:nvPicPr>
+                  <pic:blipFill>
+                    <a:blip r:embed="rId14" cstate="none"/>
+                    <a:srcRect/>
+                    <a:stretch>
+                      <a:fillRect/>
+                    </a:stretch>
+                  </pic:blipFill>
+                  <pic:spPr bwMode="auto">
+                    <a:xfrm>
+                      <a:off x="0" y="0"/>
+                      <a:ext cx="5762625" cy="2867025"/>
+                    </a:xfrm>
+                    <a:prstGeom prst="rect">
+                      <a:avLst/>
+                    </a:prstGeom>
+                  </pic:spPr>
+                </pic:pic>
+              </a:graphicData>
+            </a:graphic>
+          </wp:inline>
+        </w:drawing>
+      </w:r>
+    </w:p>
+    <w:p>
+      <w:pPr>
+        <w:spacing w:after="200" w:before="60"/>
+        <w:jc w:val="center"/>
+      </w:pPr>
+      <w:r>
+        <w:rPr>
+          <w:rFonts w:ascii="Calibri" w:cs="Calibri" w:eastAsia="Calibri" w:hAnsi="Calibri"/>
+          <w:i/>
+          <w:iCs/>
+          <w:color w:val="52514e"/>
+          <w:sz w:val="18"/>
+          <w:szCs w:val="18"/>
+        </w:rPr>
+        <w:t xml:space="preserve">Figure 7. Transit demand profile along the corridor, 2022 survey-only matrix, both directions; dashed: the earlier ticketing-based profile.</w:t>
+      </w:r>
+    </w:p>
+    <w:p>
+      <w:pPr>
+        <w:pStyle w:val="Heading1"/>
+        <w:spacing w:after="160" w:before="360"/>
+      </w:pPr>
+      <w:r>
+        <w:rPr>
+          <w:rFonts w:ascii="Calibri" w:cs="Calibri" w:eastAsia="Calibri" w:hAnsi="Calibri"/>
+        </w:rPr>
+        <w:t xml:space="preserve">8. Part F — comparing and testing the profiles</w:t>
+      </w:r>
+    </w:p>
+    <w:p>
+      <w:pPr>
+        <w:pStyle w:val="Heading2"/>
+        <w:spacing w:after="120" w:before="280"/>
+      </w:pPr>
+      <w:r>
+        <w:rPr>
+          <w:rFonts w:ascii="Calibri" w:cs="Calibri" w:eastAsia="Calibri" w:hAnsi="Calibri"/>
+        </w:rPr>
+        <w:t xml:space="preserve">8.1 Calibrated survey versus ticketing</w:t>
+      </w:r>
+    </w:p>
+    <w:p>
+      <w:pPr>
+        <w:spacing w:after="120" w:line="276"/>
+      </w:pPr>
+      <w:r>
+        <w:rPr>
+          <w:rFonts w:ascii="Calibri" w:cs="Calibri" w:eastAsia="Calibri" w:hAnsi="Calibri"/>
+          <w:sz w:val="22"/>
+          <w:szCs w:val="22"/>
+        </w:rPr>
+        <w:t xml:space="preserve">The transit profile of this report (the "hybrid" of survey and ticketing) was compared link by link with the earlier ticketing-based profile (RavKav journeys spread over on-board destinations, plus the station-based train matrix), including the intermediate steps of the calibration and the area pairs that drive the differences.</w:t>
       </w:r>
     </w:p>
     <w:p>
@@ -11283,7 +12136,7 @@
           <w:sz w:val="22"/>
           <w:szCs w:val="22"/>
         </w:rPr>
-        <w:t xml:space="preserve">Two frames. </w:t>
+        <w:t xml:space="preserve">Towards Nazareth the bus profiles agree. </w:t>
       </w:r>
       <w:r>
         <w:rPr>
@@ -11291,7 +12144,7 @@
           <w:sz w:val="22"/>
           <w:szCs w:val="22"/>
         </w:rPr>
-        <w:t xml:space="preserve">Ticketing journeys start at the boarding stop and include non-residents; survey trips start at the front door and cover residents. At superzone level the two mostly coincide, except at transfer hubs. The calibrated volumes are right for corridor loadings and slightly too concentrated for door-to-door demand at the hubs.</w:t>
+        <w:t xml:space="preserve">Once the survey bus is calibrated, its link flows sit within about 10 % of the ticketing bus along the whole Haifa segment; the raw 2018 survey had been 25–40 % lower. The transit total is nevertheless 1.5 times the ticketing one in this direction, entirely because of shared taxis: they add 1,000–1,400 trips to every Haifa-segment link and ticketing does not see them.</w:t>
       </w:r>
     </w:p>
     <w:p>
@@ -11311,7 +12164,7 @@
           <w:sz w:val="22"/>
           <w:szCs w:val="22"/>
         </w:rPr>
-        <w:t xml:space="preserve">Ticketing coverage. </w:t>
+        <w:t xml:space="preserve">Towards Tirat Carmel ticketing is about double. </w:t>
       </w:r>
       <w:r>
         <w:rPr>
@@ -11319,7 +12172,1880 @@
           <w:sz w:val="22"/>
           <w:szCs w:val="22"/>
         </w:rPr>
-        <w:t xml:space="preserve">The ticketing extract under-records bus travel in the Arab-sector and peripheral superzones. Until the provider confirms which operators and fare types it covers, RavKav volumes should not be used outside the metropolitan core.</w:t>
+        <w:t xml:space="preserve">From Ein Hayam to Kiryat Bialik South the ticketing profile is about double, and three times at the Nazareth end. The cause is journeys from the Nazareth Area (1,363 ticketed against 417 survey-based), from Hamifrats and from Neve Yosef into Haifa's western districts. Hamifrats and Neve Yosef are transfer hubs, where ticketing places journeys at the boarding point; the Nazareth Area is where the coverage guard kept the survey's volumes.</w:t>
+      </w:r>
+    </w:p>
+    <w:p>
+      <w:pPr>
+        <w:spacing w:after="0" w:before="120"/>
+        <w:jc w:val="center"/>
+      </w:pPr>
+      <w:r>
+        <w:drawing>
+          <wp:inline distT="0" distB="0" distL="0" distR="0">
+            <wp:extent cx="5762625" cy="4238625"/>
+            <wp:effectExtent t="0" r="0" b="0" l="0"/>
+            <wp:docPr id="1" name="" descr="" title=""/>
+            <wp:cNvGraphicFramePr>
+              <a:graphicFrameLocks xmlns:a="http://schemas.openxmlformats.org/drawingml/2006/main" noChangeAspect="1"/>
+            </wp:cNvGraphicFramePr>
+            <a:graphic xmlns:a="http://schemas.openxmlformats.org/drawingml/2006/main">
+              <a:graphicData uri="http://schemas.openxmlformats.org/drawingml/2006/picture">
+                <pic:pic xmlns:pic="http://schemas.openxmlformats.org/drawingml/2006/picture">
+                  <pic:nvPicPr>
+                    <pic:cNvPr id="0" name="" descr=""/>
+                    <pic:cNvPicPr>
+                      <a:picLocks noChangeAspect="1" noChangeArrowheads="1"/>
+                    </pic:cNvPicPr>
+                  </pic:nvPicPr>
+                  <pic:blipFill>
+                    <a:blip r:embed="rId15" cstate="none"/>
+                    <a:srcRect/>
+                    <a:stretch>
+                      <a:fillRect/>
+                    </a:stretch>
+                  </pic:blipFill>
+                  <pic:spPr bwMode="auto">
+                    <a:xfrm>
+                      <a:off x="0" y="0"/>
+                      <a:ext cx="5762625" cy="4238625"/>
+                    </a:xfrm>
+                    <a:prstGeom prst="rect">
+                      <a:avLst/>
+                    </a:prstGeom>
+                  </pic:spPr>
+                </pic:pic>
+              </a:graphicData>
+            </a:graphic>
+          </wp:inline>
+        </w:drawing>
+      </w:r>
+    </w:p>
+    <w:p>
+      <w:pPr>
+        <w:spacing w:after="200" w:before="60"/>
+        <w:jc w:val="center"/>
+      </w:pPr>
+      <w:r>
+        <w:rPr>
+          <w:rFonts w:ascii="Calibri" w:cs="Calibri" w:eastAsia="Calibri" w:hAnsi="Calibri"/>
+          <w:i/>
+          <w:iCs/>
+          <w:color w:val="52514e"/>
+          <w:sz w:val="18"/>
+          <w:szCs w:val="18"/>
+        </w:rPr>
+        <w:t xml:space="preserve">Figure 8. Bus and transit profiles by direction: raw survey, all-RavKav step, calibrated survey (hybrid) and ticketing.</w:t>
+      </w:r>
+    </w:p>
+    <w:p>
+      <w:pPr>
+        <w:pStyle w:val="Heading2"/>
+        <w:spacing w:after="120" w:before="280"/>
+      </w:pPr>
+      <w:r>
+        <w:rPr>
+          <w:rFonts w:ascii="Calibri" w:cs="Calibri" w:eastAsia="Calibri" w:hAnsi="Calibri"/>
+        </w:rPr>
+        <w:t xml:space="preserve">8.2 What the ticketing shortfall really is</w:t>
+      </w:r>
+    </w:p>
+    <w:p>
+      <w:pPr>
+        <w:spacing w:after="120" w:line="276"/>
+      </w:pPr>
+      <w:r>
+        <w:rPr>
+          <w:rFonts w:ascii="Calibri" w:cs="Calibri" w:eastAsia="Calibri" w:hAnsi="Calibri"/>
+          <w:sz w:val="22"/>
+          <w:szCs w:val="22"/>
+        </w:rPr>
+        <w:t xml:space="preserve">Splitting the guarded superzones' bus trips into local trips (inside the superzone) and trips to other superzones changes the reading of the coverage finding:</w:t>
+      </w:r>
+    </w:p>
+    <w:tbl>
+      <w:tblPr>
+        <w:tblW w:type="dxa" w:w="9026"/>
+        <w:tblBorders>
+          <w:top w:val="single" w:color="auto" w:sz="4"/>
+          <w:left w:val="single" w:color="auto" w:sz="4"/>
+          <w:bottom w:val="single" w:color="auto" w:sz="4"/>
+          <w:right w:val="single" w:color="auto" w:sz="4"/>
+          <w:insideH w:val="single" w:color="auto" w:sz="4"/>
+          <w:insideV w:val="single" w:color="auto" w:sz="4"/>
+        </w:tblBorders>
+      </w:tblPr>
+      <w:tblGrid>
+        <w:gridCol w:w="2407"/>
+        <w:gridCol w:w="1605"/>
+        <w:gridCol w:w="1805"/>
+        <w:gridCol w:w="1605"/>
+        <w:gridCol w:w="1605"/>
+      </w:tblGrid>
+      <w:tr>
+        <w:trPr>
+          <w:tblHeader/>
+        </w:trPr>
+        <w:tc>
+          <w:tcPr>
+            <w:tcW w:type="dxa" w:w="2407"/>
+            <w:shd w:fill="e8f0fb" w:color="auto" w:val="clear"/>
+            <w:tcMar>
+              <w:top w:type="dxa" w:w="60"/>
+              <w:left w:type="dxa" w:w="90"/>
+              <w:bottom w:type="dxa" w:w="60"/>
+              <w:right w:type="dxa" w:w="90"/>
+            </w:tcMar>
+          </w:tcPr>
+          <w:p>
+            <w:pPr>
+              <w:spacing w:after="0" w:line="240"/>
+              <w:jc w:val="left"/>
+            </w:pPr>
+            <w:r>
+              <w:rPr>
+                <w:rFonts w:ascii="Calibri" w:cs="Calibri" w:eastAsia="Calibri" w:hAnsi="Calibri"/>
+                <w:b/>
+                <w:bCs/>
+                <w:sz w:val="19"/>
+                <w:szCs w:val="19"/>
+              </w:rPr>
+              <w:t xml:space="preserve">Superzone</w:t>
+            </w:r>
+          </w:p>
+        </w:tc>
+        <w:tc>
+          <w:tcPr>
+            <w:tcW w:type="dxa" w:w="1605"/>
+            <w:shd w:fill="e8f0fb" w:color="auto" w:val="clear"/>
+            <w:tcMar>
+              <w:top w:type="dxa" w:w="60"/>
+              <w:left w:type="dxa" w:w="90"/>
+              <w:bottom w:type="dxa" w:w="60"/>
+              <w:right w:type="dxa" w:w="90"/>
+            </w:tcMar>
+          </w:tcPr>
+          <w:p>
+            <w:pPr>
+              <w:spacing w:after="0" w:line="240"/>
+              <w:jc w:val="center"/>
+            </w:pPr>
+            <w:r>
+              <w:rPr>
+                <w:rFonts w:ascii="Calibri" w:cs="Calibri" w:eastAsia="Calibri" w:hAnsi="Calibri"/>
+                <w:b/>
+                <w:bCs/>
+                <w:sz w:val="19"/>
+                <w:szCs w:val="19"/>
+              </w:rPr>
+              <w:t xml:space="preserve">Ticketing ÷ survey, local trips</w:t>
+            </w:r>
+          </w:p>
+        </w:tc>
+        <w:tc>
+          <w:tcPr>
+            <w:tcW w:type="dxa" w:w="1805"/>
+            <w:shd w:fill="e8f0fb" w:color="auto" w:val="clear"/>
+            <w:tcMar>
+              <w:top w:type="dxa" w:w="60"/>
+              <w:left w:type="dxa" w:w="90"/>
+              <w:bottom w:type="dxa" w:w="60"/>
+              <w:right w:type="dxa" w:w="90"/>
+            </w:tcMar>
+          </w:tcPr>
+          <w:p>
+            <w:pPr>
+              <w:spacing w:after="0" w:line="240"/>
+              <w:jc w:val="center"/>
+            </w:pPr>
+            <w:r>
+              <w:rPr>
+                <w:rFonts w:ascii="Calibri" w:cs="Calibri" w:eastAsia="Calibri" w:hAnsi="Calibri"/>
+                <w:b/>
+                <w:bCs/>
+                <w:sz w:val="19"/>
+                <w:szCs w:val="19"/>
+              </w:rPr>
+              <w:t xml:space="preserve">Ticketing ÷ survey, trips to other superzones</w:t>
+            </w:r>
+          </w:p>
+        </w:tc>
+        <w:tc>
+          <w:tcPr>
+            <w:tcW w:type="dxa" w:w="1605"/>
+            <w:shd w:fill="e8f0fb" w:color="auto" w:val="clear"/>
+            <w:tcMar>
+              <w:top w:type="dxa" w:w="60"/>
+              <w:left w:type="dxa" w:w="90"/>
+              <w:bottom w:type="dxa" w:w="60"/>
+              <w:right w:type="dxa" w:w="90"/>
+            </w:tcMar>
+          </w:tcPr>
+          <w:p>
+            <w:pPr>
+              <w:spacing w:after="0" w:line="240"/>
+              <w:jc w:val="center"/>
+            </w:pPr>
+            <w:r>
+              <w:rPr>
+                <w:rFonts w:ascii="Calibri" w:cs="Calibri" w:eastAsia="Calibri" w:hAnsi="Calibri"/>
+                <w:b/>
+                <w:bCs/>
+                <w:sz w:val="19"/>
+                <w:szCs w:val="19"/>
+              </w:rPr>
+              <w:t xml:space="preserve">Survey trips to Haifa superzones</w:t>
+            </w:r>
+          </w:p>
+        </w:tc>
+        <w:tc>
+          <w:tcPr>
+            <w:tcW w:type="dxa" w:w="1605"/>
+            <w:shd w:fill="e8f0fb" w:color="auto" w:val="clear"/>
+            <w:tcMar>
+              <w:top w:type="dxa" w:w="60"/>
+              <w:left w:type="dxa" w:w="90"/>
+              <w:bottom w:type="dxa" w:w="60"/>
+              <w:right w:type="dxa" w:w="90"/>
+            </w:tcMar>
+          </w:tcPr>
+          <w:p>
+            <w:pPr>
+              <w:spacing w:after="0" w:line="240"/>
+              <w:jc w:val="center"/>
+            </w:pPr>
+            <w:r>
+              <w:rPr>
+                <w:rFonts w:ascii="Calibri" w:cs="Calibri" w:eastAsia="Calibri" w:hAnsi="Calibri"/>
+                <w:b/>
+                <w:bCs/>
+                <w:sz w:val="19"/>
+                <w:szCs w:val="19"/>
+              </w:rPr>
+              <w:t xml:space="preserve">Ticketed trips to Haifa superzones</w:t>
+            </w:r>
+          </w:p>
+        </w:tc>
+      </w:tr>
+      <w:tr>
+        <w:tc>
+          <w:tcPr>
+            <w:tcW w:type="dxa" w:w="2407"/>
+            <w:tcMar>
+              <w:top w:type="dxa" w:w="60"/>
+              <w:left w:type="dxa" w:w="90"/>
+              <w:bottom w:type="dxa" w:w="60"/>
+              <w:right w:type="dxa" w:w="90"/>
+            </w:tcMar>
+          </w:tcPr>
+          <w:p>
+            <w:pPr>
+              <w:spacing w:after="0" w:line="240"/>
+              <w:jc w:val="left"/>
+            </w:pPr>
+            <w:r>
+              <w:rPr>
+                <w:rFonts w:ascii="Calibri" w:cs="Calibri" w:eastAsia="Calibri" w:hAnsi="Calibri"/>
+                <w:b w:val="false"/>
+                <w:bCs w:val="false"/>
+                <w:sz w:val="19"/>
+                <w:szCs w:val="19"/>
+              </w:rPr>
+              <w:t xml:space="preserve">19 Nazareth, Kafr Kanna</w:t>
+            </w:r>
+          </w:p>
+        </w:tc>
+        <w:tc>
+          <w:tcPr>
+            <w:tcW w:type="dxa" w:w="1605"/>
+            <w:tcMar>
+              <w:top w:type="dxa" w:w="60"/>
+              <w:left w:type="dxa" w:w="90"/>
+              <w:bottom w:type="dxa" w:w="60"/>
+              <w:right w:type="dxa" w:w="90"/>
+            </w:tcMar>
+          </w:tcPr>
+          <w:p>
+            <w:pPr>
+              <w:spacing w:after="0" w:line="240"/>
+              <w:jc w:val="right"/>
+            </w:pPr>
+            <w:r>
+              <w:rPr>
+                <w:rFonts w:ascii="Calibri" w:cs="Calibri" w:eastAsia="Calibri" w:hAnsi="Calibri"/>
+                <w:b w:val="false"/>
+                <w:bCs w:val="false"/>
+                <w:sz w:val="19"/>
+                <w:szCs w:val="19"/>
+              </w:rPr>
+              <w:t xml:space="preserve">0.08</w:t>
+            </w:r>
+          </w:p>
+        </w:tc>
+        <w:tc>
+          <w:tcPr>
+            <w:tcW w:type="dxa" w:w="1805"/>
+            <w:tcMar>
+              <w:top w:type="dxa" w:w="60"/>
+              <w:left w:type="dxa" w:w="90"/>
+              <w:bottom w:type="dxa" w:w="60"/>
+              <w:right w:type="dxa" w:w="90"/>
+            </w:tcMar>
+          </w:tcPr>
+          <w:p>
+            <w:pPr>
+              <w:spacing w:after="0" w:line="240"/>
+              <w:jc w:val="right"/>
+            </w:pPr>
+            <w:r>
+              <w:rPr>
+                <w:rFonts w:ascii="Calibri" w:cs="Calibri" w:eastAsia="Calibri" w:hAnsi="Calibri"/>
+                <w:b w:val="false"/>
+                <w:bCs w:val="false"/>
+                <w:sz w:val="19"/>
+                <w:szCs w:val="19"/>
+              </w:rPr>
+              <w:t xml:space="preserve">0.34</w:t>
+            </w:r>
+          </w:p>
+        </w:tc>
+        <w:tc>
+          <w:tcPr>
+            <w:tcW w:type="dxa" w:w="1605"/>
+            <w:tcMar>
+              <w:top w:type="dxa" w:w="60"/>
+              <w:left w:type="dxa" w:w="90"/>
+              <w:bottom w:type="dxa" w:w="60"/>
+              <w:right w:type="dxa" w:w="90"/>
+            </w:tcMar>
+          </w:tcPr>
+          <w:p>
+            <w:pPr>
+              <w:spacing w:after="0" w:line="240"/>
+              <w:jc w:val="right"/>
+            </w:pPr>
+            <w:r>
+              <w:rPr>
+                <w:rFonts w:ascii="Calibri" w:cs="Calibri" w:eastAsia="Calibri" w:hAnsi="Calibri"/>
+                <w:b w:val="false"/>
+                <w:bCs w:val="false"/>
+                <w:sz w:val="19"/>
+                <w:szCs w:val="19"/>
+              </w:rPr>
+              <w:t xml:space="preserve">1,680</w:t>
+            </w:r>
+          </w:p>
+        </w:tc>
+        <w:tc>
+          <w:tcPr>
+            <w:tcW w:type="dxa" w:w="1605"/>
+            <w:tcMar>
+              <w:top w:type="dxa" w:w="60"/>
+              <w:left w:type="dxa" w:w="90"/>
+              <w:bottom w:type="dxa" w:w="60"/>
+              <w:right w:type="dxa" w:w="90"/>
+            </w:tcMar>
+          </w:tcPr>
+          <w:p>
+            <w:pPr>
+              <w:spacing w:after="0" w:line="240"/>
+              <w:jc w:val="right"/>
+            </w:pPr>
+            <w:r>
+              <w:rPr>
+                <w:rFonts w:ascii="Calibri" w:cs="Calibri" w:eastAsia="Calibri" w:hAnsi="Calibri"/>
+                <w:b w:val="false"/>
+                <w:bCs w:val="false"/>
+                <w:sz w:val="19"/>
+                <w:szCs w:val="19"/>
+              </w:rPr>
+              <w:t xml:space="preserve">1,237</w:t>
+            </w:r>
+          </w:p>
+        </w:tc>
+      </w:tr>
+      <w:tr>
+        <w:tc>
+          <w:tcPr>
+            <w:tcW w:type="dxa" w:w="2407"/>
+            <w:tcMar>
+              <w:top w:type="dxa" w:w="60"/>
+              <w:left w:type="dxa" w:w="90"/>
+              <w:bottom w:type="dxa" w:w="60"/>
+              <w:right w:type="dxa" w:w="90"/>
+            </w:tcMar>
+          </w:tcPr>
+          <w:p>
+            <w:pPr>
+              <w:spacing w:after="0" w:line="240"/>
+              <w:jc w:val="left"/>
+            </w:pPr>
+            <w:r>
+              <w:rPr>
+                <w:rFonts w:ascii="Calibri" w:cs="Calibri" w:eastAsia="Calibri" w:hAnsi="Calibri"/>
+                <w:b w:val="false"/>
+                <w:bCs w:val="false"/>
+                <w:sz w:val="19"/>
+                <w:szCs w:val="19"/>
+              </w:rPr>
+              <w:t xml:space="preserve">4 Shefa-'Amr, Tamra</w:t>
+            </w:r>
+          </w:p>
+        </w:tc>
+        <w:tc>
+          <w:tcPr>
+            <w:tcW w:type="dxa" w:w="1605"/>
+            <w:tcMar>
+              <w:top w:type="dxa" w:w="60"/>
+              <w:left w:type="dxa" w:w="90"/>
+              <w:bottom w:type="dxa" w:w="60"/>
+              <w:right w:type="dxa" w:w="90"/>
+            </w:tcMar>
+          </w:tcPr>
+          <w:p>
+            <w:pPr>
+              <w:spacing w:after="0" w:line="240"/>
+              <w:jc w:val="right"/>
+            </w:pPr>
+            <w:r>
+              <w:rPr>
+                <w:rFonts w:ascii="Calibri" w:cs="Calibri" w:eastAsia="Calibri" w:hAnsi="Calibri"/>
+                <w:b w:val="false"/>
+                <w:bCs w:val="false"/>
+                <w:sz w:val="19"/>
+                <w:szCs w:val="19"/>
+              </w:rPr>
+              <w:t xml:space="preserve">0.75</w:t>
+            </w:r>
+          </w:p>
+        </w:tc>
+        <w:tc>
+          <w:tcPr>
+            <w:tcW w:type="dxa" w:w="1805"/>
+            <w:tcMar>
+              <w:top w:type="dxa" w:w="60"/>
+              <w:left w:type="dxa" w:w="90"/>
+              <w:bottom w:type="dxa" w:w="60"/>
+              <w:right w:type="dxa" w:w="90"/>
+            </w:tcMar>
+          </w:tcPr>
+          <w:p>
+            <w:pPr>
+              <w:spacing w:after="0" w:line="240"/>
+              <w:jc w:val="right"/>
+            </w:pPr>
+            <w:r>
+              <w:rPr>
+                <w:rFonts w:ascii="Calibri" w:cs="Calibri" w:eastAsia="Calibri" w:hAnsi="Calibri"/>
+                <w:b w:val="false"/>
+                <w:bCs w:val="false"/>
+                <w:sz w:val="19"/>
+                <w:szCs w:val="19"/>
+              </w:rPr>
+              <w:t xml:space="preserve">0.31</w:t>
+            </w:r>
+          </w:p>
+        </w:tc>
+        <w:tc>
+          <w:tcPr>
+            <w:tcW w:type="dxa" w:w="1605"/>
+            <w:tcMar>
+              <w:top w:type="dxa" w:w="60"/>
+              <w:left w:type="dxa" w:w="90"/>
+              <w:bottom w:type="dxa" w:w="60"/>
+              <w:right w:type="dxa" w:w="90"/>
+            </w:tcMar>
+          </w:tcPr>
+          <w:p>
+            <w:pPr>
+              <w:spacing w:after="0" w:line="240"/>
+              <w:jc w:val="right"/>
+            </w:pPr>
+            <w:r>
+              <w:rPr>
+                <w:rFonts w:ascii="Calibri" w:cs="Calibri" w:eastAsia="Calibri" w:hAnsi="Calibri"/>
+                <w:b w:val="false"/>
+                <w:bCs w:val="false"/>
+                <w:sz w:val="19"/>
+                <w:szCs w:val="19"/>
+              </w:rPr>
+              <w:t xml:space="preserve">1,358</w:t>
+            </w:r>
+          </w:p>
+        </w:tc>
+        <w:tc>
+          <w:tcPr>
+            <w:tcW w:type="dxa" w:w="1605"/>
+            <w:tcMar>
+              <w:top w:type="dxa" w:w="60"/>
+              <w:left w:type="dxa" w:w="90"/>
+              <w:bottom w:type="dxa" w:w="60"/>
+              <w:right w:type="dxa" w:w="90"/>
+            </w:tcMar>
+          </w:tcPr>
+          <w:p>
+            <w:pPr>
+              <w:spacing w:after="0" w:line="240"/>
+              <w:jc w:val="right"/>
+            </w:pPr>
+            <w:r>
+              <w:rPr>
+                <w:rFonts w:ascii="Calibri" w:cs="Calibri" w:eastAsia="Calibri" w:hAnsi="Calibri"/>
+                <w:b w:val="false"/>
+                <w:bCs w:val="false"/>
+                <w:sz w:val="19"/>
+                <w:szCs w:val="19"/>
+              </w:rPr>
+              <w:t xml:space="preserve">278</w:t>
+            </w:r>
+          </w:p>
+        </w:tc>
+      </w:tr>
+      <w:tr>
+        <w:tc>
+          <w:tcPr>
+            <w:tcW w:type="dxa" w:w="2407"/>
+            <w:tcMar>
+              <w:top w:type="dxa" w:w="60"/>
+              <w:left w:type="dxa" w:w="90"/>
+              <w:bottom w:type="dxa" w:w="60"/>
+              <w:right w:type="dxa" w:w="90"/>
+            </w:tcMar>
+          </w:tcPr>
+          <w:p>
+            <w:pPr>
+              <w:spacing w:after="0" w:line="240"/>
+              <w:jc w:val="left"/>
+            </w:pPr>
+            <w:r>
+              <w:rPr>
+                <w:rFonts w:ascii="Calibri" w:cs="Calibri" w:eastAsia="Calibri" w:hAnsi="Calibri"/>
+                <w:b w:val="false"/>
+                <w:bCs w:val="false"/>
+                <w:sz w:val="19"/>
+                <w:szCs w:val="19"/>
+              </w:rPr>
+              <w:t xml:space="preserve">23 Daliyat al-Karmel, Isfiya</w:t>
+            </w:r>
+          </w:p>
+        </w:tc>
+        <w:tc>
+          <w:tcPr>
+            <w:tcW w:type="dxa" w:w="1605"/>
+            <w:tcMar>
+              <w:top w:type="dxa" w:w="60"/>
+              <w:left w:type="dxa" w:w="90"/>
+              <w:bottom w:type="dxa" w:w="60"/>
+              <w:right w:type="dxa" w:w="90"/>
+            </w:tcMar>
+          </w:tcPr>
+          <w:p>
+            <w:pPr>
+              <w:spacing w:after="0" w:line="240"/>
+              <w:jc w:val="right"/>
+            </w:pPr>
+            <w:r>
+              <w:rPr>
+                <w:rFonts w:ascii="Calibri" w:cs="Calibri" w:eastAsia="Calibri" w:hAnsi="Calibri"/>
+                <w:b w:val="false"/>
+                <w:bCs w:val="false"/>
+                <w:sz w:val="19"/>
+                <w:szCs w:val="19"/>
+              </w:rPr>
+              <w:t xml:space="preserve">0.17</w:t>
+            </w:r>
+          </w:p>
+        </w:tc>
+        <w:tc>
+          <w:tcPr>
+            <w:tcW w:type="dxa" w:w="1805"/>
+            <w:tcMar>
+              <w:top w:type="dxa" w:w="60"/>
+              <w:left w:type="dxa" w:w="90"/>
+              <w:bottom w:type="dxa" w:w="60"/>
+              <w:right w:type="dxa" w:w="90"/>
+            </w:tcMar>
+          </w:tcPr>
+          <w:p>
+            <w:pPr>
+              <w:spacing w:after="0" w:line="240"/>
+              <w:jc w:val="right"/>
+            </w:pPr>
+            <w:r>
+              <w:rPr>
+                <w:rFonts w:ascii="Calibri" w:cs="Calibri" w:eastAsia="Calibri" w:hAnsi="Calibri"/>
+                <w:b w:val="false"/>
+                <w:bCs w:val="false"/>
+                <w:sz w:val="19"/>
+                <w:szCs w:val="19"/>
+              </w:rPr>
+              <w:t xml:space="preserve">0.66</w:t>
+            </w:r>
+          </w:p>
+        </w:tc>
+        <w:tc>
+          <w:tcPr>
+            <w:tcW w:type="dxa" w:w="1605"/>
+            <w:tcMar>
+              <w:top w:type="dxa" w:w="60"/>
+              <w:left w:type="dxa" w:w="90"/>
+              <w:bottom w:type="dxa" w:w="60"/>
+              <w:right w:type="dxa" w:w="90"/>
+            </w:tcMar>
+          </w:tcPr>
+          <w:p>
+            <w:pPr>
+              <w:spacing w:after="0" w:line="240"/>
+              <w:jc w:val="right"/>
+            </w:pPr>
+            <w:r>
+              <w:rPr>
+                <w:rFonts w:ascii="Calibri" w:cs="Calibri" w:eastAsia="Calibri" w:hAnsi="Calibri"/>
+                <w:b w:val="false"/>
+                <w:bCs w:val="false"/>
+                <w:sz w:val="19"/>
+                <w:szCs w:val="19"/>
+              </w:rPr>
+              <w:t xml:space="preserve">841</w:t>
+            </w:r>
+          </w:p>
+        </w:tc>
+        <w:tc>
+          <w:tcPr>
+            <w:tcW w:type="dxa" w:w="1605"/>
+            <w:tcMar>
+              <w:top w:type="dxa" w:w="60"/>
+              <w:left w:type="dxa" w:w="90"/>
+              <w:bottom w:type="dxa" w:w="60"/>
+              <w:right w:type="dxa" w:w="90"/>
+            </w:tcMar>
+          </w:tcPr>
+          <w:p>
+            <w:pPr>
+              <w:spacing w:after="0" w:line="240"/>
+              <w:jc w:val="right"/>
+            </w:pPr>
+            <w:r>
+              <w:rPr>
+                <w:rFonts w:ascii="Calibri" w:cs="Calibri" w:eastAsia="Calibri" w:hAnsi="Calibri"/>
+                <w:b w:val="false"/>
+                <w:bCs w:val="false"/>
+                <w:sz w:val="19"/>
+                <w:szCs w:val="19"/>
+              </w:rPr>
+              <w:t xml:space="preserve">622</w:t>
+            </w:r>
+          </w:p>
+        </w:tc>
+      </w:tr>
+      <w:tr>
+        <w:tc>
+          <w:tcPr>
+            <w:tcW w:type="dxa" w:w="2407"/>
+            <w:tcMar>
+              <w:top w:type="dxa" w:w="60"/>
+              <w:left w:type="dxa" w:w="90"/>
+              <w:bottom w:type="dxa" w:w="60"/>
+              <w:right w:type="dxa" w:w="90"/>
+            </w:tcMar>
+          </w:tcPr>
+          <w:p>
+            <w:pPr>
+              <w:spacing w:after="0" w:line="240"/>
+              <w:jc w:val="left"/>
+            </w:pPr>
+            <w:r>
+              <w:rPr>
+                <w:rFonts w:ascii="Calibri" w:cs="Calibri" w:eastAsia="Calibri" w:hAnsi="Calibri"/>
+                <w:b w:val="false"/>
+                <w:bCs w:val="false"/>
+                <w:sz w:val="19"/>
+                <w:szCs w:val="19"/>
+              </w:rPr>
+              <w:t xml:space="preserve">30 Sakhnin, Arraba</w:t>
+            </w:r>
+          </w:p>
+        </w:tc>
+        <w:tc>
+          <w:tcPr>
+            <w:tcW w:type="dxa" w:w="1605"/>
+            <w:tcMar>
+              <w:top w:type="dxa" w:w="60"/>
+              <w:left w:type="dxa" w:w="90"/>
+              <w:bottom w:type="dxa" w:w="60"/>
+              <w:right w:type="dxa" w:w="90"/>
+            </w:tcMar>
+          </w:tcPr>
+          <w:p>
+            <w:pPr>
+              <w:spacing w:after="0" w:line="240"/>
+              <w:jc w:val="right"/>
+            </w:pPr>
+            <w:r>
+              <w:rPr>
+                <w:rFonts w:ascii="Calibri" w:cs="Calibri" w:eastAsia="Calibri" w:hAnsi="Calibri"/>
+                <w:b w:val="false"/>
+                <w:bCs w:val="false"/>
+                <w:sz w:val="19"/>
+                <w:szCs w:val="19"/>
+              </w:rPr>
+              <w:t xml:space="preserve">0.24</w:t>
+            </w:r>
+          </w:p>
+        </w:tc>
+        <w:tc>
+          <w:tcPr>
+            <w:tcW w:type="dxa" w:w="1805"/>
+            <w:tcMar>
+              <w:top w:type="dxa" w:w="60"/>
+              <w:left w:type="dxa" w:w="90"/>
+              <w:bottom w:type="dxa" w:w="60"/>
+              <w:right w:type="dxa" w:w="90"/>
+            </w:tcMar>
+          </w:tcPr>
+          <w:p>
+            <w:pPr>
+              <w:spacing w:after="0" w:line="240"/>
+              <w:jc w:val="right"/>
+            </w:pPr>
+            <w:r>
+              <w:rPr>
+                <w:rFonts w:ascii="Calibri" w:cs="Calibri" w:eastAsia="Calibri" w:hAnsi="Calibri"/>
+                <w:b w:val="false"/>
+                <w:bCs w:val="false"/>
+                <w:sz w:val="19"/>
+                <w:szCs w:val="19"/>
+              </w:rPr>
+              <w:t xml:space="preserve">0.33</w:t>
+            </w:r>
+          </w:p>
+        </w:tc>
+        <w:tc>
+          <w:tcPr>
+            <w:tcW w:type="dxa" w:w="1605"/>
+            <w:tcMar>
+              <w:top w:type="dxa" w:w="60"/>
+              <w:left w:type="dxa" w:w="90"/>
+              <w:bottom w:type="dxa" w:w="60"/>
+              <w:right w:type="dxa" w:w="90"/>
+            </w:tcMar>
+          </w:tcPr>
+          <w:p>
+            <w:pPr>
+              <w:spacing w:after="0" w:line="240"/>
+              <w:jc w:val="right"/>
+            </w:pPr>
+            <w:r>
+              <w:rPr>
+                <w:rFonts w:ascii="Calibri" w:cs="Calibri" w:eastAsia="Calibri" w:hAnsi="Calibri"/>
+                <w:b w:val="false"/>
+                <w:bCs w:val="false"/>
+                <w:sz w:val="19"/>
+                <w:szCs w:val="19"/>
+              </w:rPr>
+              <w:t xml:space="preserve">158</w:t>
+            </w:r>
+          </w:p>
+        </w:tc>
+        <w:tc>
+          <w:tcPr>
+            <w:tcW w:type="dxa" w:w="1605"/>
+            <w:tcMar>
+              <w:top w:type="dxa" w:w="60"/>
+              <w:left w:type="dxa" w:w="90"/>
+              <w:bottom w:type="dxa" w:w="60"/>
+              <w:right w:type="dxa" w:w="90"/>
+            </w:tcMar>
+          </w:tcPr>
+          <w:p>
+            <w:pPr>
+              <w:spacing w:after="0" w:line="240"/>
+              <w:jc w:val="right"/>
+            </w:pPr>
+            <w:r>
+              <w:rPr>
+                <w:rFonts w:ascii="Calibri" w:cs="Calibri" w:eastAsia="Calibri" w:hAnsi="Calibri"/>
+                <w:b w:val="false"/>
+                <w:bCs w:val="false"/>
+                <w:sz w:val="19"/>
+                <w:szCs w:val="19"/>
+              </w:rPr>
+              <w:t xml:space="preserve">68</w:t>
+            </w:r>
+          </w:p>
+        </w:tc>
+      </w:tr>
+      <w:tr>
+        <w:tc>
+          <w:tcPr>
+            <w:tcW w:type="dxa" w:w="2407"/>
+            <w:tcMar>
+              <w:top w:type="dxa" w:w="60"/>
+              <w:left w:type="dxa" w:w="90"/>
+              <w:bottom w:type="dxa" w:w="60"/>
+              <w:right w:type="dxa" w:w="90"/>
+            </w:tcMar>
+          </w:tcPr>
+          <w:p>
+            <w:pPr>
+              <w:spacing w:after="0" w:line="240"/>
+              <w:jc w:val="left"/>
+            </w:pPr>
+            <w:r>
+              <w:rPr>
+                <w:rFonts w:ascii="Calibri" w:cs="Calibri" w:eastAsia="Calibri" w:hAnsi="Calibri"/>
+                <w:b w:val="false"/>
+                <w:bCs w:val="false"/>
+                <w:sz w:val="19"/>
+                <w:szCs w:val="19"/>
+              </w:rPr>
+              <w:t xml:space="preserve">34 Ma'alot, Beit Jann</w:t>
+            </w:r>
+          </w:p>
+        </w:tc>
+        <w:tc>
+          <w:tcPr>
+            <w:tcW w:type="dxa" w:w="1605"/>
+            <w:tcMar>
+              <w:top w:type="dxa" w:w="60"/>
+              <w:left w:type="dxa" w:w="90"/>
+              <w:bottom w:type="dxa" w:w="60"/>
+              <w:right w:type="dxa" w:w="90"/>
+            </w:tcMar>
+          </w:tcPr>
+          <w:p>
+            <w:pPr>
+              <w:spacing w:after="0" w:line="240"/>
+              <w:jc w:val="right"/>
+            </w:pPr>
+            <w:r>
+              <w:rPr>
+                <w:rFonts w:ascii="Calibri" w:cs="Calibri" w:eastAsia="Calibri" w:hAnsi="Calibri"/>
+                <w:b w:val="false"/>
+                <w:bCs w:val="false"/>
+                <w:sz w:val="19"/>
+                <w:szCs w:val="19"/>
+              </w:rPr>
+              <w:t xml:space="preserve">0.10</w:t>
+            </w:r>
+          </w:p>
+        </w:tc>
+        <w:tc>
+          <w:tcPr>
+            <w:tcW w:type="dxa" w:w="1805"/>
+            <w:tcMar>
+              <w:top w:type="dxa" w:w="60"/>
+              <w:left w:type="dxa" w:w="90"/>
+              <w:bottom w:type="dxa" w:w="60"/>
+              <w:right w:type="dxa" w:w="90"/>
+            </w:tcMar>
+          </w:tcPr>
+          <w:p>
+            <w:pPr>
+              <w:spacing w:after="0" w:line="240"/>
+              <w:jc w:val="right"/>
+            </w:pPr>
+            <w:r>
+              <w:rPr>
+                <w:rFonts w:ascii="Calibri" w:cs="Calibri" w:eastAsia="Calibri" w:hAnsi="Calibri"/>
+                <w:b w:val="false"/>
+                <w:bCs w:val="false"/>
+                <w:sz w:val="19"/>
+                <w:szCs w:val="19"/>
+              </w:rPr>
+              <w:t xml:space="preserve">0.55</w:t>
+            </w:r>
+          </w:p>
+        </w:tc>
+        <w:tc>
+          <w:tcPr>
+            <w:tcW w:type="dxa" w:w="1605"/>
+            <w:tcMar>
+              <w:top w:type="dxa" w:w="60"/>
+              <w:left w:type="dxa" w:w="90"/>
+              <w:bottom w:type="dxa" w:w="60"/>
+              <w:right w:type="dxa" w:w="90"/>
+            </w:tcMar>
+          </w:tcPr>
+          <w:p>
+            <w:pPr>
+              <w:spacing w:after="0" w:line="240"/>
+              <w:jc w:val="right"/>
+            </w:pPr>
+            <w:r>
+              <w:rPr>
+                <w:rFonts w:ascii="Calibri" w:cs="Calibri" w:eastAsia="Calibri" w:hAnsi="Calibri"/>
+                <w:b w:val="false"/>
+                <w:bCs w:val="false"/>
+                <w:sz w:val="19"/>
+                <w:szCs w:val="19"/>
+              </w:rPr>
+              <w:t xml:space="preserve">0</w:t>
+            </w:r>
+          </w:p>
+        </w:tc>
+        <w:tc>
+          <w:tcPr>
+            <w:tcW w:type="dxa" w:w="1605"/>
+            <w:tcMar>
+              <w:top w:type="dxa" w:w="60"/>
+              <w:left w:type="dxa" w:w="90"/>
+              <w:bottom w:type="dxa" w:w="60"/>
+              <w:right w:type="dxa" w:w="90"/>
+            </w:tcMar>
+          </w:tcPr>
+          <w:p>
+            <w:pPr>
+              <w:spacing w:after="0" w:line="240"/>
+              <w:jc w:val="right"/>
+            </w:pPr>
+            <w:r>
+              <w:rPr>
+                <w:rFonts w:ascii="Calibri" w:cs="Calibri" w:eastAsia="Calibri" w:hAnsi="Calibri"/>
+                <w:b w:val="false"/>
+                <w:bCs w:val="false"/>
+                <w:sz w:val="19"/>
+                <w:szCs w:val="19"/>
+              </w:rPr>
+              <w:t xml:space="preserve">149</w:t>
+            </w:r>
+          </w:p>
+        </w:tc>
+      </w:tr>
+      <w:tr>
+        <w:tc>
+          <w:tcPr>
+            <w:tcW w:type="dxa" w:w="2407"/>
+            <w:tcMar>
+              <w:top w:type="dxa" w:w="60"/>
+              <w:left w:type="dxa" w:w="90"/>
+              <w:bottom w:type="dxa" w:w="60"/>
+              <w:right w:type="dxa" w:w="90"/>
+            </w:tcMar>
+          </w:tcPr>
+          <w:p>
+            <w:pPr>
+              <w:spacing w:after="0" w:line="240"/>
+              <w:jc w:val="left"/>
+            </w:pPr>
+            <w:r>
+              <w:rPr>
+                <w:rFonts w:ascii="Calibri" w:cs="Calibri" w:eastAsia="Calibri" w:hAnsi="Calibri"/>
+                <w:b w:val="false"/>
+                <w:bCs w:val="false"/>
+                <w:sz w:val="19"/>
+                <w:szCs w:val="19"/>
+              </w:rPr>
+              <w:t xml:space="preserve">33 Safed</w:t>
+            </w:r>
+          </w:p>
+        </w:tc>
+        <w:tc>
+          <w:tcPr>
+            <w:tcW w:type="dxa" w:w="1605"/>
+            <w:tcMar>
+              <w:top w:type="dxa" w:w="60"/>
+              <w:left w:type="dxa" w:w="90"/>
+              <w:bottom w:type="dxa" w:w="60"/>
+              <w:right w:type="dxa" w:w="90"/>
+            </w:tcMar>
+          </w:tcPr>
+          <w:p>
+            <w:pPr>
+              <w:spacing w:after="0" w:line="240"/>
+              <w:jc w:val="right"/>
+            </w:pPr>
+            <w:r>
+              <w:rPr>
+                <w:rFonts w:ascii="Calibri" w:cs="Calibri" w:eastAsia="Calibri" w:hAnsi="Calibri"/>
+                <w:b w:val="false"/>
+                <w:bCs w:val="false"/>
+                <w:sz w:val="19"/>
+                <w:szCs w:val="19"/>
+              </w:rPr>
+              <w:t xml:space="preserve">0.16</w:t>
+            </w:r>
+          </w:p>
+        </w:tc>
+        <w:tc>
+          <w:tcPr>
+            <w:tcW w:type="dxa" w:w="1805"/>
+            <w:tcMar>
+              <w:top w:type="dxa" w:w="60"/>
+              <w:left w:type="dxa" w:w="90"/>
+              <w:bottom w:type="dxa" w:w="60"/>
+              <w:right w:type="dxa" w:w="90"/>
+            </w:tcMar>
+          </w:tcPr>
+          <w:p>
+            <w:pPr>
+              <w:spacing w:after="0" w:line="240"/>
+              <w:jc w:val="right"/>
+            </w:pPr>
+            <w:r>
+              <w:rPr>
+                <w:rFonts w:ascii="Calibri" w:cs="Calibri" w:eastAsia="Calibri" w:hAnsi="Calibri"/>
+                <w:b w:val="false"/>
+                <w:bCs w:val="false"/>
+                <w:sz w:val="19"/>
+                <w:szCs w:val="19"/>
+              </w:rPr>
+              <w:t xml:space="preserve">1.22</w:t>
+            </w:r>
+          </w:p>
+        </w:tc>
+        <w:tc>
+          <w:tcPr>
+            <w:tcW w:type="dxa" w:w="1605"/>
+            <w:tcMar>
+              <w:top w:type="dxa" w:w="60"/>
+              <w:left w:type="dxa" w:w="90"/>
+              <w:bottom w:type="dxa" w:w="60"/>
+              <w:right w:type="dxa" w:w="90"/>
+            </w:tcMar>
+          </w:tcPr>
+          <w:p>
+            <w:pPr>
+              <w:spacing w:after="0" w:line="240"/>
+              <w:jc w:val="right"/>
+            </w:pPr>
+            <w:r>
+              <w:rPr>
+                <w:rFonts w:ascii="Calibri" w:cs="Calibri" w:eastAsia="Calibri" w:hAnsi="Calibri"/>
+                <w:b w:val="false"/>
+                <w:bCs w:val="false"/>
+                <w:sz w:val="19"/>
+                <w:szCs w:val="19"/>
+              </w:rPr>
+              <w:t xml:space="preserve">175</w:t>
+            </w:r>
+          </w:p>
+        </w:tc>
+        <w:tc>
+          <w:tcPr>
+            <w:tcW w:type="dxa" w:w="1605"/>
+            <w:tcMar>
+              <w:top w:type="dxa" w:w="60"/>
+              <w:left w:type="dxa" w:w="90"/>
+              <w:bottom w:type="dxa" w:w="60"/>
+              <w:right w:type="dxa" w:w="90"/>
+            </w:tcMar>
+          </w:tcPr>
+          <w:p>
+            <w:pPr>
+              <w:spacing w:after="0" w:line="240"/>
+              <w:jc w:val="right"/>
+            </w:pPr>
+            <w:r>
+              <w:rPr>
+                <w:rFonts w:ascii="Calibri" w:cs="Calibri" w:eastAsia="Calibri" w:hAnsi="Calibri"/>
+                <w:b w:val="false"/>
+                <w:bCs w:val="false"/>
+                <w:sz w:val="19"/>
+                <w:szCs w:val="19"/>
+              </w:rPr>
+              <w:t xml:space="preserve">68</w:t>
+            </w:r>
+          </w:p>
+        </w:tc>
+      </w:tr>
+      <w:tr>
+        <w:tc>
+          <w:tcPr>
+            <w:tcW w:type="dxa" w:w="2407"/>
+            <w:tcMar>
+              <w:top w:type="dxa" w:w="60"/>
+              <w:left w:type="dxa" w:w="90"/>
+              <w:bottom w:type="dxa" w:w="60"/>
+              <w:right w:type="dxa" w:w="90"/>
+            </w:tcMar>
+          </w:tcPr>
+          <w:p>
+            <w:pPr>
+              <w:spacing w:after="0" w:line="240"/>
+              <w:jc w:val="left"/>
+            </w:pPr>
+            <w:r>
+              <w:rPr>
+                <w:rFonts w:ascii="Calibri" w:cs="Calibri" w:eastAsia="Calibri" w:hAnsi="Calibri"/>
+                <w:b w:val="false"/>
+                <w:bCs w:val="false"/>
+                <w:sz w:val="19"/>
+                <w:szCs w:val="19"/>
+              </w:rPr>
+              <w:t xml:space="preserve">37 Beit She'an</w:t>
+            </w:r>
+          </w:p>
+        </w:tc>
+        <w:tc>
+          <w:tcPr>
+            <w:tcW w:type="dxa" w:w="1605"/>
+            <w:tcMar>
+              <w:top w:type="dxa" w:w="60"/>
+              <w:left w:type="dxa" w:w="90"/>
+              <w:bottom w:type="dxa" w:w="60"/>
+              <w:right w:type="dxa" w:w="90"/>
+            </w:tcMar>
+          </w:tcPr>
+          <w:p>
+            <w:pPr>
+              <w:spacing w:after="0" w:line="240"/>
+              <w:jc w:val="right"/>
+            </w:pPr>
+            <w:r>
+              <w:rPr>
+                <w:rFonts w:ascii="Calibri" w:cs="Calibri" w:eastAsia="Calibri" w:hAnsi="Calibri"/>
+                <w:b w:val="false"/>
+                <w:bCs w:val="false"/>
+                <w:sz w:val="19"/>
+                <w:szCs w:val="19"/>
+              </w:rPr>
+              <w:t xml:space="preserve">0.05</w:t>
+            </w:r>
+          </w:p>
+        </w:tc>
+        <w:tc>
+          <w:tcPr>
+            <w:tcW w:type="dxa" w:w="1805"/>
+            <w:tcMar>
+              <w:top w:type="dxa" w:w="60"/>
+              <w:left w:type="dxa" w:w="90"/>
+              <w:bottom w:type="dxa" w:w="60"/>
+              <w:right w:type="dxa" w:w="90"/>
+            </w:tcMar>
+          </w:tcPr>
+          <w:p>
+            <w:pPr>
+              <w:spacing w:after="0" w:line="240"/>
+              <w:jc w:val="right"/>
+            </w:pPr>
+            <w:r>
+              <w:rPr>
+                <w:rFonts w:ascii="Calibri" w:cs="Calibri" w:eastAsia="Calibri" w:hAnsi="Calibri"/>
+                <w:b w:val="false"/>
+                <w:bCs w:val="false"/>
+                <w:sz w:val="19"/>
+                <w:szCs w:val="19"/>
+              </w:rPr>
+              <w:t xml:space="preserve">0.55</w:t>
+            </w:r>
+          </w:p>
+        </w:tc>
+        <w:tc>
+          <w:tcPr>
+            <w:tcW w:type="dxa" w:w="1605"/>
+            <w:tcMar>
+              <w:top w:type="dxa" w:w="60"/>
+              <w:left w:type="dxa" w:w="90"/>
+              <w:bottom w:type="dxa" w:w="60"/>
+              <w:right w:type="dxa" w:w="90"/>
+            </w:tcMar>
+          </w:tcPr>
+          <w:p>
+            <w:pPr>
+              <w:spacing w:after="0" w:line="240"/>
+              <w:jc w:val="right"/>
+            </w:pPr>
+            <w:r>
+              <w:rPr>
+                <w:rFonts w:ascii="Calibri" w:cs="Calibri" w:eastAsia="Calibri" w:hAnsi="Calibri"/>
+                <w:b w:val="false"/>
+                <w:bCs w:val="false"/>
+                <w:sz w:val="19"/>
+                <w:szCs w:val="19"/>
+              </w:rPr>
+              <w:t xml:space="preserve">0</w:t>
+            </w:r>
+          </w:p>
+        </w:tc>
+        <w:tc>
+          <w:tcPr>
+            <w:tcW w:type="dxa" w:w="1605"/>
+            <w:tcMar>
+              <w:top w:type="dxa" w:w="60"/>
+              <w:left w:type="dxa" w:w="90"/>
+              <w:bottom w:type="dxa" w:w="60"/>
+              <w:right w:type="dxa" w:w="90"/>
+            </w:tcMar>
+          </w:tcPr>
+          <w:p>
+            <w:pPr>
+              <w:spacing w:after="0" w:line="240"/>
+              <w:jc w:val="right"/>
+            </w:pPr>
+            <w:r>
+              <w:rPr>
+                <w:rFonts w:ascii="Calibri" w:cs="Calibri" w:eastAsia="Calibri" w:hAnsi="Calibri"/>
+                <w:b w:val="false"/>
+                <w:bCs w:val="false"/>
+                <w:sz w:val="19"/>
+                <w:szCs w:val="19"/>
+              </w:rPr>
+              <w:t xml:space="preserve">566</w:t>
+            </w:r>
+          </w:p>
+        </w:tc>
+      </w:tr>
+      <w:tr>
+        <w:tc>
+          <w:tcPr>
+            <w:tcW w:type="dxa" w:w="2407"/>
+            <w:tcMar>
+              <w:top w:type="dxa" w:w="60"/>
+              <w:left w:type="dxa" w:w="90"/>
+              <w:bottom w:type="dxa" w:w="60"/>
+              <w:right w:type="dxa" w:w="90"/>
+            </w:tcMar>
+          </w:tcPr>
+          <w:p>
+            <w:pPr>
+              <w:spacing w:after="0" w:line="240"/>
+              <w:jc w:val="left"/>
+            </w:pPr>
+            <w:r>
+              <w:rPr>
+                <w:rFonts w:ascii="Calibri" w:cs="Calibri" w:eastAsia="Calibri" w:hAnsi="Calibri"/>
+                <w:b w:val="false"/>
+                <w:bCs w:val="false"/>
+                <w:sz w:val="19"/>
+                <w:szCs w:val="19"/>
+              </w:rPr>
+              <w:t xml:space="preserve">17 Haifa (for comparison)</w:t>
+            </w:r>
+          </w:p>
+        </w:tc>
+        <w:tc>
+          <w:tcPr>
+            <w:tcW w:type="dxa" w:w="1605"/>
+            <w:tcMar>
+              <w:top w:type="dxa" w:w="60"/>
+              <w:left w:type="dxa" w:w="90"/>
+              <w:bottom w:type="dxa" w:w="60"/>
+              <w:right w:type="dxa" w:w="90"/>
+            </w:tcMar>
+          </w:tcPr>
+          <w:p>
+            <w:pPr>
+              <w:spacing w:after="0" w:line="240"/>
+              <w:jc w:val="right"/>
+            </w:pPr>
+            <w:r>
+              <w:rPr>
+                <w:rFonts w:ascii="Calibri" w:cs="Calibri" w:eastAsia="Calibri" w:hAnsi="Calibri"/>
+                <w:b w:val="false"/>
+                <w:bCs w:val="false"/>
+                <w:sz w:val="19"/>
+                <w:szCs w:val="19"/>
+              </w:rPr>
+              <w:t xml:space="preserve">0.74</w:t>
+            </w:r>
+          </w:p>
+        </w:tc>
+        <w:tc>
+          <w:tcPr>
+            <w:tcW w:type="dxa" w:w="1805"/>
+            <w:tcMar>
+              <w:top w:type="dxa" w:w="60"/>
+              <w:left w:type="dxa" w:w="90"/>
+              <w:bottom w:type="dxa" w:w="60"/>
+              <w:right w:type="dxa" w:w="90"/>
+            </w:tcMar>
+          </w:tcPr>
+          <w:p>
+            <w:pPr>
+              <w:spacing w:after="0" w:line="240"/>
+              <w:jc w:val="right"/>
+            </w:pPr>
+            <w:r>
+              <w:rPr>
+                <w:rFonts w:ascii="Calibri" w:cs="Calibri" w:eastAsia="Calibri" w:hAnsi="Calibri"/>
+                <w:b w:val="false"/>
+                <w:bCs w:val="false"/>
+                <w:sz w:val="19"/>
+                <w:szCs w:val="19"/>
+              </w:rPr>
+              <w:t xml:space="preserve">1.06</w:t>
+            </w:r>
+          </w:p>
+        </w:tc>
+        <w:tc>
+          <w:tcPr>
+            <w:tcW w:type="dxa" w:w="1605"/>
+            <w:tcMar>
+              <w:top w:type="dxa" w:w="60"/>
+              <w:left w:type="dxa" w:w="90"/>
+              <w:bottom w:type="dxa" w:w="60"/>
+              <w:right w:type="dxa" w:w="90"/>
+            </w:tcMar>
+          </w:tcPr>
+          <w:p>
+            <w:pPr>
+              <w:spacing w:after="0" w:line="240"/>
+              <w:jc w:val="right"/>
+            </w:pPr>
+            <w:r>
+              <w:rPr>
+                <w:rFonts w:ascii="Calibri" w:cs="Calibri" w:eastAsia="Calibri" w:hAnsi="Calibri"/>
+                <w:b w:val="false"/>
+                <w:bCs w:val="false"/>
+                <w:sz w:val="19"/>
+                <w:szCs w:val="19"/>
+              </w:rPr>
+              <w:t xml:space="preserve">6,494</w:t>
+            </w:r>
+          </w:p>
+        </w:tc>
+        <w:tc>
+          <w:tcPr>
+            <w:tcW w:type="dxa" w:w="1605"/>
+            <w:tcMar>
+              <w:top w:type="dxa" w:w="60"/>
+              <w:left w:type="dxa" w:w="90"/>
+              <w:bottom w:type="dxa" w:w="60"/>
+              <w:right w:type="dxa" w:w="90"/>
+            </w:tcMar>
+          </w:tcPr>
+          <w:p>
+            <w:pPr>
+              <w:spacing w:after="0" w:line="240"/>
+              <w:jc w:val="right"/>
+            </w:pPr>
+            <w:r>
+              <w:rPr>
+                <w:rFonts w:ascii="Calibri" w:cs="Calibri" w:eastAsia="Calibri" w:hAnsi="Calibri"/>
+                <w:b w:val="false"/>
+                <w:bCs w:val="false"/>
+                <w:sz w:val="19"/>
+                <w:szCs w:val="19"/>
+              </w:rPr>
+              <w:t xml:space="preserve">6,411</w:t>
+            </w:r>
+          </w:p>
+        </w:tc>
+      </w:tr>
+    </w:tbl>
+    <w:p>
+      <w:pPr>
+        <w:spacing w:after="200" w:before="60"/>
+        <w:jc w:val="center"/>
+      </w:pPr>
+      <w:r>
+        <w:rPr>
+          <w:rFonts w:ascii="Calibri" w:cs="Calibri" w:eastAsia="Calibri" w:hAnsi="Calibri"/>
+          <w:i/>
+          <w:iCs/>
+          <w:color w:val="52514e"/>
+          <w:sz w:val="18"/>
+          <w:szCs w:val="18"/>
+        </w:rPr>
+        <w:t xml:space="preserve">Ticketing coverage split into local and inter-superzone bus trips.</w:t>
+      </w:r>
+    </w:p>
+    <w:p>
+      <w:pPr>
+        <w:spacing w:after="120" w:line="276"/>
+      </w:pPr>
+      <w:r>
+        <w:rPr>
+          <w:rFonts w:ascii="Calibri" w:cs="Calibri" w:eastAsia="Calibri" w:hAnsi="Calibri"/>
+          <w:sz w:val="22"/>
+          <w:szCs w:val="22"/>
+        </w:rPr>
+        <w:t xml:space="preserve">The under-coverage sits in local bus travel — town services, cash fares or unticketed operators — while the intercity market that matters for the corridor is reasonably covered (74 % in Nazareth). The coverage guard was applied to whole superzone rows, so it also kept the survey's volumes on the intercity market, which is why the profile towards Tirat Carmel is light at the Nazareth end. The refinement is to apply the coverage rule separately to local and inter-superzone trips. It is recorded in the task list; it would change the two-mode matrix, the 2022 matrices, the profiles and the figures of this report, and has not been run yet.</w:t>
+      </w:r>
+    </w:p>
+    <w:p>
+      <w:pPr>
+        <w:pStyle w:val="Heading2"/>
+        <w:spacing w:after="120" w:before="280"/>
+      </w:pPr>
+      <w:r>
+        <w:rPr>
+          <w:rFonts w:ascii="Calibri" w:cs="Calibri" w:eastAsia="Calibri" w:hAnsi="Calibri"/>
+        </w:rPr>
+        <w:t xml:space="preserve">8.3 Testing the profiles against the cellular hybrid</w:t>
+      </w:r>
+    </w:p>
+    <w:p>
+      <w:pPr>
+        <w:spacing w:after="120" w:line="276"/>
+      </w:pPr>
+      <w:r>
+        <w:rPr>
+          <w:rFonts w:ascii="Calibri" w:cs="Calibri" w:eastAsia="Calibri" w:hAnsi="Calibri"/>
+          <w:sz w:val="22"/>
+          <w:szCs w:val="22"/>
+        </w:rPr>
+        <w:t xml:space="preserve">Should the profiles be tested with a KS test? No: a KS test compares samples from distributions, and a profile is a fixed-order curve of 17 dependent, weighted values. Two fitting statistics were used instead. GEH per link and direction, the statistic made for link flows; and a shape descriptor D, the largest gap between the two cumulative link-trip-share curves along the line, which says where along the line the shapes diverge. Both were judged against the survey's day 1 and day 2 profiles rebuilt with the same allocation.</w:t>
+      </w:r>
+    </w:p>
+    <w:p>
+      <w:pPr>
+        <w:spacing w:after="120" w:line="276"/>
+      </w:pPr>
+      <w:r>
+        <w:rPr>
+          <w:rFonts w:ascii="Calibri" w:cs="Calibri" w:eastAsia="Calibri" w:hAnsi="Calibri"/>
+          <w:sz w:val="22"/>
+          <w:szCs w:val="22"/>
+        </w:rPr>
+        <w:t xml:space="preserve">To compare fairly, the cellular hybrid and the survey-only matrix were both taken at 2018 with the same mode content: the hybrid's walk and other layer was removed with the survey's own other-mode share per superzone pair.</w:t>
+      </w:r>
+    </w:p>
+    <w:tbl>
+      <w:tblPr>
+        <w:tblW w:type="dxa" w:w="9026"/>
+        <w:tblBorders>
+          <w:top w:val="single" w:color="auto" w:sz="4"/>
+          <w:left w:val="single" w:color="auto" w:sz="4"/>
+          <w:bottom w:val="single" w:color="auto" w:sz="4"/>
+          <w:right w:val="single" w:color="auto" w:sz="4"/>
+          <w:insideH w:val="single" w:color="auto" w:sz="4"/>
+          <w:insideV w:val="single" w:color="auto" w:sz="4"/>
+        </w:tblBorders>
+      </w:tblPr>
+      <w:tblGrid>
+        <w:gridCol w:w="4012"/>
+        <w:gridCol w:w="2507"/>
+        <w:gridCol w:w="2507"/>
+      </w:tblGrid>
+      <w:tr>
+        <w:trPr>
+          <w:tblHeader/>
+        </w:trPr>
+        <w:tc>
+          <w:tcPr>
+            <w:tcW w:type="dxa" w:w="4012"/>
+            <w:shd w:fill="e8f0fb" w:color="auto" w:val="clear"/>
+            <w:tcMar>
+              <w:top w:type="dxa" w:w="60"/>
+              <w:left w:type="dxa" w:w="90"/>
+              <w:bottom w:type="dxa" w:w="60"/>
+              <w:right w:type="dxa" w:w="90"/>
+            </w:tcMar>
+          </w:tcPr>
+          <w:p>
+            <w:pPr>
+              <w:spacing w:after="0" w:line="240"/>
+              <w:jc w:val="left"/>
+            </w:pPr>
+            <w:r>
+              <w:rPr>
+                <w:rFonts w:ascii="Calibri" w:cs="Calibri" w:eastAsia="Calibri" w:hAnsi="Calibri"/>
+                <w:b/>
+                <w:bCs/>
+                <w:sz w:val="19"/>
+                <w:szCs w:val="19"/>
+              </w:rPr>
+              <w:t xml:space="preserve">Share of link flow within GEH 5 / largest GEH / shape D</w:t>
+            </w:r>
+          </w:p>
+        </w:tc>
+        <w:tc>
+          <w:tcPr>
+            <w:tcW w:type="dxa" w:w="2507"/>
+            <w:shd w:fill="e8f0fb" w:color="auto" w:val="clear"/>
+            <w:tcMar>
+              <w:top w:type="dxa" w:w="60"/>
+              <w:left w:type="dxa" w:w="90"/>
+              <w:bottom w:type="dxa" w:w="60"/>
+              <w:right w:type="dxa" w:w="90"/>
+            </w:tcMar>
+          </w:tcPr>
+          <w:p>
+            <w:pPr>
+              <w:spacing w:after="0" w:line="240"/>
+              <w:jc w:val="center"/>
+            </w:pPr>
+            <w:r>
+              <w:rPr>
+                <w:rFonts w:ascii="Calibri" w:cs="Calibri" w:eastAsia="Calibri" w:hAnsi="Calibri"/>
+                <w:b/>
+                <w:bCs/>
+                <w:sz w:val="19"/>
+                <w:szCs w:val="19"/>
+              </w:rPr>
+              <w:t xml:space="preserve">Towards Nazareth</w:t>
+            </w:r>
+          </w:p>
+        </w:tc>
+        <w:tc>
+          <w:tcPr>
+            <w:tcW w:type="dxa" w:w="2507"/>
+            <w:shd w:fill="e8f0fb" w:color="auto" w:val="clear"/>
+            <w:tcMar>
+              <w:top w:type="dxa" w:w="60"/>
+              <w:left w:type="dxa" w:w="90"/>
+              <w:bottom w:type="dxa" w:w="60"/>
+              <w:right w:type="dxa" w:w="90"/>
+            </w:tcMar>
+          </w:tcPr>
+          <w:p>
+            <w:pPr>
+              <w:spacing w:after="0" w:line="240"/>
+              <w:jc w:val="center"/>
+            </w:pPr>
+            <w:r>
+              <w:rPr>
+                <w:rFonts w:ascii="Calibri" w:cs="Calibri" w:eastAsia="Calibri" w:hAnsi="Calibri"/>
+                <w:b/>
+                <w:bCs/>
+                <w:sz w:val="19"/>
+                <w:szCs w:val="19"/>
+              </w:rPr>
+              <w:t xml:space="preserve">Towards Tirat Carmel</w:t>
+            </w:r>
+          </w:p>
+        </w:tc>
+      </w:tr>
+      <w:tr>
+        <w:tc>
+          <w:tcPr>
+            <w:tcW w:type="dxa" w:w="4012"/>
+            <w:tcMar>
+              <w:top w:type="dxa" w:w="60"/>
+              <w:left w:type="dxa" w:w="90"/>
+              <w:bottom w:type="dxa" w:w="60"/>
+              <w:right w:type="dxa" w:w="90"/>
+            </w:tcMar>
+          </w:tcPr>
+          <w:p>
+            <w:pPr>
+              <w:spacing w:after="0" w:line="240"/>
+              <w:jc w:val="left"/>
+            </w:pPr>
+            <w:r>
+              <w:rPr>
+                <w:rFonts w:ascii="Calibri" w:cs="Calibri" w:eastAsia="Calibri" w:hAnsi="Calibri"/>
+                <w:b w:val="false"/>
+                <w:bCs w:val="false"/>
+                <w:sz w:val="19"/>
+                <w:szCs w:val="19"/>
+              </w:rPr>
+              <w:t xml:space="preserve">Total, hybrid vs survey-only</w:t>
+            </w:r>
+          </w:p>
+        </w:tc>
+        <w:tc>
+          <w:tcPr>
+            <w:tcW w:type="dxa" w:w="2507"/>
+            <w:tcMar>
+              <w:top w:type="dxa" w:w="60"/>
+              <w:left w:type="dxa" w:w="90"/>
+              <w:bottom w:type="dxa" w:w="60"/>
+              <w:right w:type="dxa" w:w="90"/>
+            </w:tcMar>
+          </w:tcPr>
+          <w:p>
+            <w:pPr>
+              <w:spacing w:after="0" w:line="240"/>
+              <w:jc w:val="right"/>
+            </w:pPr>
+            <w:r>
+              <w:rPr>
+                <w:rFonts w:ascii="Calibri" w:cs="Calibri" w:eastAsia="Calibri" w:hAnsi="Calibri"/>
+                <w:b w:val="false"/>
+                <w:bCs w:val="false"/>
+                <w:sz w:val="19"/>
+                <w:szCs w:val="19"/>
+              </w:rPr>
+              <w:t xml:space="preserve">57 % / 15 / 0.07</w:t>
+            </w:r>
+          </w:p>
+        </w:tc>
+        <w:tc>
+          <w:tcPr>
+            <w:tcW w:type="dxa" w:w="2507"/>
+            <w:tcMar>
+              <w:top w:type="dxa" w:w="60"/>
+              <w:left w:type="dxa" w:w="90"/>
+              <w:bottom w:type="dxa" w:w="60"/>
+              <w:right w:type="dxa" w:w="90"/>
+            </w:tcMar>
+          </w:tcPr>
+          <w:p>
+            <w:pPr>
+              <w:spacing w:after="0" w:line="240"/>
+              <w:jc w:val="right"/>
+            </w:pPr>
+            <w:r>
+              <w:rPr>
+                <w:rFonts w:ascii="Calibri" w:cs="Calibri" w:eastAsia="Calibri" w:hAnsi="Calibri"/>
+                <w:b w:val="false"/>
+                <w:bCs w:val="false"/>
+                <w:sz w:val="19"/>
+                <w:szCs w:val="19"/>
+              </w:rPr>
+              <w:t xml:space="preserve">31 % / 29 / 0.13</w:t>
+            </w:r>
+          </w:p>
+        </w:tc>
+      </w:tr>
+      <w:tr>
+        <w:tc>
+          <w:tcPr>
+            <w:tcW w:type="dxa" w:w="4012"/>
+            <w:tcMar>
+              <w:top w:type="dxa" w:w="60"/>
+              <w:left w:type="dxa" w:w="90"/>
+              <w:bottom w:type="dxa" w:w="60"/>
+              <w:right w:type="dxa" w:w="90"/>
+            </w:tcMar>
+          </w:tcPr>
+          <w:p>
+            <w:pPr>
+              <w:spacing w:after="0" w:line="240"/>
+              <w:jc w:val="left"/>
+            </w:pPr>
+            <w:r>
+              <w:rPr>
+                <w:rFonts w:ascii="Calibri" w:cs="Calibri" w:eastAsia="Calibri" w:hAnsi="Calibri"/>
+                <w:b w:val="false"/>
+                <w:bCs w:val="false"/>
+                <w:sz w:val="19"/>
+                <w:szCs w:val="19"/>
+              </w:rPr>
+              <w:t xml:space="preserve">Total, survey day 1 vs day 2</w:t>
+            </w:r>
+          </w:p>
+        </w:tc>
+        <w:tc>
+          <w:tcPr>
+            <w:tcW w:type="dxa" w:w="2507"/>
+            <w:tcMar>
+              <w:top w:type="dxa" w:w="60"/>
+              <w:left w:type="dxa" w:w="90"/>
+              <w:bottom w:type="dxa" w:w="60"/>
+              <w:right w:type="dxa" w:w="90"/>
+            </w:tcMar>
+          </w:tcPr>
+          <w:p>
+            <w:pPr>
+              <w:spacing w:after="0" w:line="240"/>
+              <w:jc w:val="right"/>
+            </w:pPr>
+            <w:r>
+              <w:rPr>
+                <w:rFonts w:ascii="Calibri" w:cs="Calibri" w:eastAsia="Calibri" w:hAnsi="Calibri"/>
+                <w:b w:val="false"/>
+                <w:bCs w:val="false"/>
+                <w:sz w:val="19"/>
+                <w:szCs w:val="19"/>
+              </w:rPr>
+              <w:t xml:space="preserve">100 % / 6 / 0.02</w:t>
+            </w:r>
+          </w:p>
+        </w:tc>
+        <w:tc>
+          <w:tcPr>
+            <w:tcW w:type="dxa" w:w="2507"/>
+            <w:tcMar>
+              <w:top w:type="dxa" w:w="60"/>
+              <w:left w:type="dxa" w:w="90"/>
+              <w:bottom w:type="dxa" w:w="60"/>
+              <w:right w:type="dxa" w:w="90"/>
+            </w:tcMar>
+          </w:tcPr>
+          <w:p>
+            <w:pPr>
+              <w:spacing w:after="0" w:line="240"/>
+              <w:jc w:val="right"/>
+            </w:pPr>
+            <w:r>
+              <w:rPr>
+                <w:rFonts w:ascii="Calibri" w:cs="Calibri" w:eastAsia="Calibri" w:hAnsi="Calibri"/>
+                <w:b w:val="false"/>
+                <w:bCs w:val="false"/>
+                <w:sz w:val="19"/>
+                <w:szCs w:val="19"/>
+              </w:rPr>
+              <w:t xml:space="preserve">25 % / 12 / 0.10</w:t>
+            </w:r>
+          </w:p>
+        </w:tc>
+      </w:tr>
+      <w:tr>
+        <w:tc>
+          <w:tcPr>
+            <w:tcW w:type="dxa" w:w="4012"/>
+            <w:tcMar>
+              <w:top w:type="dxa" w:w="60"/>
+              <w:left w:type="dxa" w:w="90"/>
+              <w:bottom w:type="dxa" w:w="60"/>
+              <w:right w:type="dxa" w:w="90"/>
+            </w:tcMar>
+          </w:tcPr>
+          <w:p>
+            <w:pPr>
+              <w:spacing w:after="0" w:line="240"/>
+              <w:jc w:val="left"/>
+            </w:pPr>
+            <w:r>
+              <w:rPr>
+                <w:rFonts w:ascii="Calibri" w:cs="Calibri" w:eastAsia="Calibri" w:hAnsi="Calibri"/>
+                <w:b w:val="false"/>
+                <w:bCs w:val="false"/>
+                <w:sz w:val="19"/>
+                <w:szCs w:val="19"/>
+              </w:rPr>
+              <w:t xml:space="preserve">Transit, hybrid vs survey-only</w:t>
+            </w:r>
+          </w:p>
+        </w:tc>
+        <w:tc>
+          <w:tcPr>
+            <w:tcW w:type="dxa" w:w="2507"/>
+            <w:tcMar>
+              <w:top w:type="dxa" w:w="60"/>
+              <w:left w:type="dxa" w:w="90"/>
+              <w:bottom w:type="dxa" w:w="60"/>
+              <w:right w:type="dxa" w:w="90"/>
+            </w:tcMar>
+          </w:tcPr>
+          <w:p>
+            <w:pPr>
+              <w:spacing w:after="0" w:line="240"/>
+              <w:jc w:val="right"/>
+            </w:pPr>
+            <w:r>
+              <w:rPr>
+                <w:rFonts w:ascii="Calibri" w:cs="Calibri" w:eastAsia="Calibri" w:hAnsi="Calibri"/>
+                <w:b w:val="false"/>
+                <w:bCs w:val="false"/>
+                <w:sz w:val="19"/>
+                <w:szCs w:val="19"/>
+              </w:rPr>
+              <w:t xml:space="preserve">23 % / 20 / 0.04</w:t>
+            </w:r>
+          </w:p>
+        </w:tc>
+        <w:tc>
+          <w:tcPr>
+            <w:tcW w:type="dxa" w:w="2507"/>
+            <w:tcMar>
+              <w:top w:type="dxa" w:w="60"/>
+              <w:left w:type="dxa" w:w="90"/>
+              <w:bottom w:type="dxa" w:w="60"/>
+              <w:right w:type="dxa" w:w="90"/>
+            </w:tcMar>
+          </w:tcPr>
+          <w:p>
+            <w:pPr>
+              <w:spacing w:after="0" w:line="240"/>
+              <w:jc w:val="right"/>
+            </w:pPr>
+            <w:r>
+              <w:rPr>
+                <w:rFonts w:ascii="Calibri" w:cs="Calibri" w:eastAsia="Calibri" w:hAnsi="Calibri"/>
+                <w:b w:val="false"/>
+                <w:bCs w:val="false"/>
+                <w:sz w:val="19"/>
+                <w:szCs w:val="19"/>
+              </w:rPr>
+              <w:t xml:space="preserve">75 % / 9 / 0.06</w:t>
+            </w:r>
+          </w:p>
+        </w:tc>
+      </w:tr>
+      <w:tr>
+        <w:tc>
+          <w:tcPr>
+            <w:tcW w:type="dxa" w:w="4012"/>
+            <w:tcMar>
+              <w:top w:type="dxa" w:w="60"/>
+              <w:left w:type="dxa" w:w="90"/>
+              <w:bottom w:type="dxa" w:w="60"/>
+              <w:right w:type="dxa" w:w="90"/>
+            </w:tcMar>
+          </w:tcPr>
+          <w:p>
+            <w:pPr>
+              <w:spacing w:after="0" w:line="240"/>
+              <w:jc w:val="left"/>
+            </w:pPr>
+            <w:r>
+              <w:rPr>
+                <w:rFonts w:ascii="Calibri" w:cs="Calibri" w:eastAsia="Calibri" w:hAnsi="Calibri"/>
+                <w:b w:val="false"/>
+                <w:bCs w:val="false"/>
+                <w:sz w:val="19"/>
+                <w:szCs w:val="19"/>
+              </w:rPr>
+              <w:t xml:space="preserve">Transit, survey day 1 vs day 2</w:t>
+            </w:r>
+          </w:p>
+        </w:tc>
+        <w:tc>
+          <w:tcPr>
+            <w:tcW w:type="dxa" w:w="2507"/>
+            <w:tcMar>
+              <w:top w:type="dxa" w:w="60"/>
+              <w:left w:type="dxa" w:w="90"/>
+              <w:bottom w:type="dxa" w:w="60"/>
+              <w:right w:type="dxa" w:w="90"/>
+            </w:tcMar>
+          </w:tcPr>
+          <w:p>
+            <w:pPr>
+              <w:spacing w:after="0" w:line="240"/>
+              <w:jc w:val="right"/>
+            </w:pPr>
+            <w:r>
+              <w:rPr>
+                <w:rFonts w:ascii="Calibri" w:cs="Calibri" w:eastAsia="Calibri" w:hAnsi="Calibri"/>
+                <w:b w:val="false"/>
+                <w:bCs w:val="false"/>
+                <w:sz w:val="19"/>
+                <w:szCs w:val="19"/>
+              </w:rPr>
+              <w:t xml:space="preserve">94 % / 7 / 0.04</w:t>
+            </w:r>
+          </w:p>
+        </w:tc>
+        <w:tc>
+          <w:tcPr>
+            <w:tcW w:type="dxa" w:w="2507"/>
+            <w:tcMar>
+              <w:top w:type="dxa" w:w="60"/>
+              <w:left w:type="dxa" w:w="90"/>
+              <w:bottom w:type="dxa" w:w="60"/>
+              <w:right w:type="dxa" w:w="90"/>
+            </w:tcMar>
+          </w:tcPr>
+          <w:p>
+            <w:pPr>
+              <w:spacing w:after="0" w:line="240"/>
+              <w:jc w:val="right"/>
+            </w:pPr>
+            <w:r>
+              <w:rPr>
+                <w:rFonts w:ascii="Calibri" w:cs="Calibri" w:eastAsia="Calibri" w:hAnsi="Calibri"/>
+                <w:b w:val="false"/>
+                <w:bCs w:val="false"/>
+                <w:sz w:val="19"/>
+                <w:szCs w:val="19"/>
+              </w:rPr>
+              <w:t xml:space="preserve">39 % / 16 / 0.13</w:t>
+            </w:r>
+          </w:p>
+        </w:tc>
+      </w:tr>
+    </w:tbl>
+    <w:p>
+      <w:pPr>
+        <w:spacing w:after="200" w:before="60"/>
+        <w:jc w:val="center"/>
+      </w:pPr>
+      <w:r>
+        <w:rPr>
+          <w:rFonts w:ascii="Calibri" w:cs="Calibri" w:eastAsia="Calibri" w:hAnsi="Calibri"/>
+          <w:i/>
+          <w:iCs/>
+          <w:color w:val="52514e"/>
+          <w:sz w:val="18"/>
+          <w:szCs w:val="18"/>
+        </w:rPr>
+        <w:t xml:space="preserve">Profile tests, cellular hybrid vs survey-only matrix, 2018, matching mode content.</w:t>
       </w:r>
     </w:p>
     <w:p>
@@ -11339,7 +14065,7 @@
           <w:sz w:val="22"/>
           <w:szCs w:val="22"/>
         </w:rPr>
-        <w:t xml:space="preserve">Trip rates are frozen. </w:t>
+        <w:t xml:space="preserve">Same shape. </w:t>
       </w:r>
       <w:r>
         <w:rPr>
@@ -11347,7 +14073,7 @@
           <w:sz w:val="22"/>
           <w:szCs w:val="22"/>
         </w:rPr>
-        <w:t xml:space="preserve">Growth to 2022 keeps 2018 trip rates and uses a forecast, not observed 2022 data. Changes in age structure, car ownership or working from home are not represented. Screenline counts (task B1) would be the natural check for the car layer.</w:t>
+        <w:t xml:space="preserve">The shape descriptors sit inside the day-to-day range everywhere, so the two matrices put the demand in the same places along the line. The differences are in level on particular segments.</w:t>
       </w:r>
     </w:p>
     <w:p>
@@ -11367,7 +14093,7 @@
           <w:sz w:val="22"/>
           <w:szCs w:val="22"/>
         </w:rPr>
-        <w:t xml:space="preserve">TAZ detail is synthetic. </w:t>
+        <w:t xml:space="preserve">Towards Nazareth. </w:t>
       </w:r>
       <w:r>
         <w:rPr>
@@ -11375,7 +14101,7 @@
           <w:sz w:val="22"/>
           <w:szCs w:val="22"/>
         </w:rPr>
-        <w:t xml:space="preserve">Below the 1,250-zone level the survey's TAZ detail is a population / employment split; for the cellular matrix it is a replication of coarse zones. TAZ-level agreement between them is flattered by construction; superzones and sub-areas are the fair level.</w:t>
+        <w:t xml:space="preserve">The total profiles agree east of Neve David and differ on the first three links from Tirat Carmel, where the cellular structure sends about 40 % more trips into the Haifa coast districts than the population / employment split does.</w:t>
       </w:r>
     </w:p>
     <w:p>
@@ -11395,7 +14121,7 @@
           <w:sz w:val="22"/>
           <w:szCs w:val="22"/>
         </w:rPr>
-        <w:t xml:space="preserve">Rail is thin. </w:t>
+        <w:t xml:space="preserve">Towards Tirat Carmel. </w:t>
       </w:r>
       <w:r>
         <w:rPr>
@@ -11403,7 +14129,7 @@
           <w:sz w:val="22"/>
           <w:szCs w:val="22"/>
         </w:rPr>
-        <w:t xml:space="preserve">54 observed rail trips over two days make the survey rail matrix a rough sketch. Use the station-based smartcard matrix where station origins are acceptable.</w:t>
+        <w:t xml:space="preserve">The biggest gap is in Haifa's west (Neve David to Bat Galim, hybrid roughly double) and in the Krayot (hybrid about a third less). But the survey's own two days disagree almost as much in this direction — only a quarter of the flow within GEH 5 — because this is where the survey sample is thinnest, so much of the gap is within noise.</w:t>
       </w:r>
     </w:p>
     <w:p>
@@ -11423,7 +14149,7 @@
           <w:sz w:val="22"/>
           <w:szCs w:val="22"/>
         </w:rPr>
-        <w:t xml:space="preserve">Cellular volumes. </w:t>
+        <w:t xml:space="preserve">Transit towards Nazareth is the one clear difference. </w:t>
       </w:r>
       <w:r>
         <w:rPr>
@@ -11431,7 +14157,591 @@
           <w:sz w:val="22"/>
           <w:szCs w:val="22"/>
         </w:rPr>
-        <w:t xml:space="preserve">The cellular product records 3.6 times fewer morning trips than the survey expansion and misses short trips in particular. Its trip definition (dwell time, minimum distance) is needed before it can anchor volumes anywhere.</w:t>
+        <w:t xml:space="preserve">The hybrid carries 35–50 % less transit than the survey-only matrix along the whole Haifa segment, while the two survey days agree there almost perfectly. The hybrid's transit is the survey's mode share applied to cellular-shaped cells, and cellular places fewer trips on the intra-Haifa pairs where the transit share is high.</w:t>
+      </w:r>
+    </w:p>
+    <w:p>
+      <w:pPr>
+        <w:spacing w:after="0" w:before="120"/>
+        <w:jc w:val="center"/>
+      </w:pPr>
+      <w:r>
+        <w:drawing>
+          <wp:inline distT="0" distB="0" distL="0" distR="0">
+            <wp:extent cx="5762625" cy="3409950"/>
+            <wp:effectExtent t="0" r="0" b="0" l="0"/>
+            <wp:docPr id="1" name="" descr="" title=""/>
+            <wp:cNvGraphicFramePr>
+              <a:graphicFrameLocks xmlns:a="http://schemas.openxmlformats.org/drawingml/2006/main" noChangeAspect="1"/>
+            </wp:cNvGraphicFramePr>
+            <a:graphic xmlns:a="http://schemas.openxmlformats.org/drawingml/2006/main">
+              <a:graphicData uri="http://schemas.openxmlformats.org/drawingml/2006/picture">
+                <pic:pic xmlns:pic="http://schemas.openxmlformats.org/drawingml/2006/picture">
+                  <pic:nvPicPr>
+                    <pic:cNvPr id="0" name="" descr=""/>
+                    <pic:cNvPicPr>
+                      <a:picLocks noChangeAspect="1" noChangeArrowheads="1"/>
+                    </pic:cNvPicPr>
+                  </pic:nvPicPr>
+                  <pic:blipFill>
+                    <a:blip r:embed="rId16" cstate="none"/>
+                    <a:srcRect/>
+                    <a:stretch>
+                      <a:fillRect/>
+                    </a:stretch>
+                  </pic:blipFill>
+                  <pic:spPr bwMode="auto">
+                    <a:xfrm>
+                      <a:off x="0" y="0"/>
+                      <a:ext cx="5762625" cy="3409950"/>
+                    </a:xfrm>
+                    <a:prstGeom prst="rect">
+                      <a:avLst/>
+                    </a:prstGeom>
+                  </pic:spPr>
+                </pic:pic>
+              </a:graphicData>
+            </a:graphic>
+          </wp:inline>
+        </w:drawing>
+      </w:r>
+    </w:p>
+    <w:p>
+      <w:pPr>
+        <w:spacing w:after="200" w:before="60"/>
+        <w:jc w:val="center"/>
+      </w:pPr>
+      <w:r>
+        <w:rPr>
+          <w:rFonts w:ascii="Calibri" w:cs="Calibri" w:eastAsia="Calibri" w:hAnsi="Calibri"/>
+          <w:i/>
+          <w:iCs/>
+          <w:color w:val="52514e"/>
+          <w:sz w:val="18"/>
+          <w:szCs w:val="18"/>
+        </w:rPr>
+        <w:t xml:space="preserve">Figure 9. Corridor profiles at 2018 with matching mode content: cellular hybrid, survey-only, and the two survey days; GEH per link above the bars.</w:t>
+      </w:r>
+    </w:p>
+    <w:p>
+      <w:pPr>
+        <w:pStyle w:val="Heading2"/>
+        <w:spacing w:after="120" w:before="280"/>
+      </w:pPr>
+      <w:r>
+        <w:rPr>
+          <w:rFonts w:ascii="Calibri" w:cs="Calibri" w:eastAsia="Calibri" w:hAnsi="Calibri"/>
+        </w:rPr>
+        <w:t xml:space="preserve">8.4 Reporting a single hour</w:t>
+      </w:r>
+    </w:p>
+    <w:p>
+      <w:pPr>
+        <w:spacing w:after="120" w:line="276"/>
+      </w:pPr>
+      <w:r>
+        <w:rPr>
+          <w:rFonts w:ascii="Calibri" w:cs="Calibri" w:eastAsia="Calibri" w:hAnsi="Calibri"/>
+          <w:sz w:val="22"/>
+          <w:szCs w:val="22"/>
+        </w:rPr>
+        <w:t xml:space="preserve">The matrices cover 6:00 to 9:00. A single-hour figure can be an average hour (one third of the matrix) or the peak hour. The sources disagree on how peaked the morning is:</w:t>
+      </w:r>
+    </w:p>
+    <w:tbl>
+      <w:tblPr>
+        <w:tblW w:type="dxa" w:w="9026"/>
+        <w:tblBorders>
+          <w:top w:val="single" w:color="auto" w:sz="4"/>
+          <w:left w:val="single" w:color="auto" w:sz="4"/>
+          <w:bottom w:val="single" w:color="auto" w:sz="4"/>
+          <w:right w:val="single" w:color="auto" w:sz="4"/>
+          <w:insideH w:val="single" w:color="auto" w:sz="4"/>
+          <w:insideV w:val="single" w:color="auto" w:sz="4"/>
+        </w:tblBorders>
+      </w:tblPr>
+      <w:tblGrid>
+        <w:gridCol w:w="4248"/>
+        <w:gridCol w:w="1593"/>
+        <w:gridCol w:w="1593"/>
+        <w:gridCol w:w="1593"/>
+      </w:tblGrid>
+      <w:tr>
+        <w:trPr>
+          <w:tblHeader/>
+        </w:trPr>
+        <w:tc>
+          <w:tcPr>
+            <w:tcW w:type="dxa" w:w="4248"/>
+            <w:shd w:fill="e8f0fb" w:color="auto" w:val="clear"/>
+            <w:tcMar>
+              <w:top w:type="dxa" w:w="60"/>
+              <w:left w:type="dxa" w:w="90"/>
+              <w:bottom w:type="dxa" w:w="60"/>
+              <w:right w:type="dxa" w:w="90"/>
+            </w:tcMar>
+          </w:tcPr>
+          <w:p>
+            <w:pPr>
+              <w:spacing w:after="0" w:line="240"/>
+              <w:jc w:val="left"/>
+            </w:pPr>
+            <w:r>
+              <w:rPr>
+                <w:rFonts w:ascii="Calibri" w:cs="Calibri" w:eastAsia="Calibri" w:hAnsi="Calibri"/>
+                <w:b/>
+                <w:bCs/>
+                <w:sz w:val="19"/>
+                <w:szCs w:val="19"/>
+              </w:rPr>
+              <w:t xml:space="preserve">Source</w:t>
+            </w:r>
+          </w:p>
+        </w:tc>
+        <w:tc>
+          <w:tcPr>
+            <w:tcW w:type="dxa" w:w="1593"/>
+            <w:shd w:fill="e8f0fb" w:color="auto" w:val="clear"/>
+            <w:tcMar>
+              <w:top w:type="dxa" w:w="60"/>
+              <w:left w:type="dxa" w:w="90"/>
+              <w:bottom w:type="dxa" w:w="60"/>
+              <w:right w:type="dxa" w:w="90"/>
+            </w:tcMar>
+          </w:tcPr>
+          <w:p>
+            <w:pPr>
+              <w:spacing w:after="0" w:line="240"/>
+              <w:jc w:val="center"/>
+            </w:pPr>
+            <w:r>
+              <w:rPr>
+                <w:rFonts w:ascii="Calibri" w:cs="Calibri" w:eastAsia="Calibri" w:hAnsi="Calibri"/>
+                <w:b/>
+                <w:bCs/>
+                <w:sz w:val="19"/>
+                <w:szCs w:val="19"/>
+              </w:rPr>
+              <w:t xml:space="preserve">6:00</w:t>
+            </w:r>
+          </w:p>
+        </w:tc>
+        <w:tc>
+          <w:tcPr>
+            <w:tcW w:type="dxa" w:w="1593"/>
+            <w:shd w:fill="e8f0fb" w:color="auto" w:val="clear"/>
+            <w:tcMar>
+              <w:top w:type="dxa" w:w="60"/>
+              <w:left w:type="dxa" w:w="90"/>
+              <w:bottom w:type="dxa" w:w="60"/>
+              <w:right w:type="dxa" w:w="90"/>
+            </w:tcMar>
+          </w:tcPr>
+          <w:p>
+            <w:pPr>
+              <w:spacing w:after="0" w:line="240"/>
+              <w:jc w:val="center"/>
+            </w:pPr>
+            <w:r>
+              <w:rPr>
+                <w:rFonts w:ascii="Calibri" w:cs="Calibri" w:eastAsia="Calibri" w:hAnsi="Calibri"/>
+                <w:b/>
+                <w:bCs/>
+                <w:sz w:val="19"/>
+                <w:szCs w:val="19"/>
+              </w:rPr>
+              <w:t xml:space="preserve">7:00</w:t>
+            </w:r>
+          </w:p>
+        </w:tc>
+        <w:tc>
+          <w:tcPr>
+            <w:tcW w:type="dxa" w:w="1593"/>
+            <w:shd w:fill="e8f0fb" w:color="auto" w:val="clear"/>
+            <w:tcMar>
+              <w:top w:type="dxa" w:w="60"/>
+              <w:left w:type="dxa" w:w="90"/>
+              <w:bottom w:type="dxa" w:w="60"/>
+              <w:right w:type="dxa" w:w="90"/>
+            </w:tcMar>
+          </w:tcPr>
+          <w:p>
+            <w:pPr>
+              <w:spacing w:after="0" w:line="240"/>
+              <w:jc w:val="center"/>
+            </w:pPr>
+            <w:r>
+              <w:rPr>
+                <w:rFonts w:ascii="Calibri" w:cs="Calibri" w:eastAsia="Calibri" w:hAnsi="Calibri"/>
+                <w:b/>
+                <w:bCs/>
+                <w:sz w:val="19"/>
+                <w:szCs w:val="19"/>
+              </w:rPr>
+              <w:t xml:space="preserve">8:00</w:t>
+            </w:r>
+          </w:p>
+        </w:tc>
+      </w:tr>
+      <w:tr>
+        <w:tc>
+          <w:tcPr>
+            <w:tcW w:type="dxa" w:w="4248"/>
+            <w:tcMar>
+              <w:top w:type="dxa" w:w="60"/>
+              <w:left w:type="dxa" w:w="90"/>
+              <w:bottom w:type="dxa" w:w="60"/>
+              <w:right w:type="dxa" w:w="90"/>
+            </w:tcMar>
+          </w:tcPr>
+          <w:p>
+            <w:pPr>
+              <w:spacing w:after="0" w:line="240"/>
+              <w:jc w:val="left"/>
+            </w:pPr>
+            <w:r>
+              <w:rPr>
+                <w:rFonts w:ascii="Calibri" w:cs="Calibri" w:eastAsia="Calibri" w:hAnsi="Calibri"/>
+                <w:b w:val="false"/>
+                <w:bCs w:val="false"/>
+                <w:sz w:val="19"/>
+                <w:szCs w:val="19"/>
+              </w:rPr>
+              <w:t xml:space="preserve">Survey, reported departure hour</w:t>
+            </w:r>
+          </w:p>
+        </w:tc>
+        <w:tc>
+          <w:tcPr>
+            <w:tcW w:type="dxa" w:w="1593"/>
+            <w:tcMar>
+              <w:top w:type="dxa" w:w="60"/>
+              <w:left w:type="dxa" w:w="90"/>
+              <w:bottom w:type="dxa" w:w="60"/>
+              <w:right w:type="dxa" w:w="90"/>
+            </w:tcMar>
+          </w:tcPr>
+          <w:p>
+            <w:pPr>
+              <w:spacing w:after="0" w:line="240"/>
+              <w:jc w:val="right"/>
+            </w:pPr>
+            <w:r>
+              <w:rPr>
+                <w:rFonts w:ascii="Calibri" w:cs="Calibri" w:eastAsia="Calibri" w:hAnsi="Calibri"/>
+                <w:b w:val="false"/>
+                <w:bCs w:val="false"/>
+                <w:sz w:val="19"/>
+                <w:szCs w:val="19"/>
+              </w:rPr>
+              <w:t xml:space="preserve">12 %</w:t>
+            </w:r>
+          </w:p>
+        </w:tc>
+        <w:tc>
+          <w:tcPr>
+            <w:tcW w:type="dxa" w:w="1593"/>
+            <w:tcMar>
+              <w:top w:type="dxa" w:w="60"/>
+              <w:left w:type="dxa" w:w="90"/>
+              <w:bottom w:type="dxa" w:w="60"/>
+              <w:right w:type="dxa" w:w="90"/>
+            </w:tcMar>
+          </w:tcPr>
+          <w:p>
+            <w:pPr>
+              <w:spacing w:after="0" w:line="240"/>
+              <w:jc w:val="right"/>
+            </w:pPr>
+            <w:r>
+              <w:rPr>
+                <w:rFonts w:ascii="Calibri" w:cs="Calibri" w:eastAsia="Calibri" w:hAnsi="Calibri"/>
+                <w:b w:val="false"/>
+                <w:bCs w:val="false"/>
+                <w:sz w:val="19"/>
+                <w:szCs w:val="19"/>
+              </w:rPr>
+              <w:t xml:space="preserve">66 %</w:t>
+            </w:r>
+          </w:p>
+        </w:tc>
+        <w:tc>
+          <w:tcPr>
+            <w:tcW w:type="dxa" w:w="1593"/>
+            <w:tcMar>
+              <w:top w:type="dxa" w:w="60"/>
+              <w:left w:type="dxa" w:w="90"/>
+              <w:bottom w:type="dxa" w:w="60"/>
+              <w:right w:type="dxa" w:w="90"/>
+            </w:tcMar>
+          </w:tcPr>
+          <w:p>
+            <w:pPr>
+              <w:spacing w:after="0" w:line="240"/>
+              <w:jc w:val="right"/>
+            </w:pPr>
+            <w:r>
+              <w:rPr>
+                <w:rFonts w:ascii="Calibri" w:cs="Calibri" w:eastAsia="Calibri" w:hAnsi="Calibri"/>
+                <w:b w:val="false"/>
+                <w:bCs w:val="false"/>
+                <w:sz w:val="19"/>
+                <w:szCs w:val="19"/>
+              </w:rPr>
+              <w:t xml:space="preserve">22 %</w:t>
+            </w:r>
+          </w:p>
+        </w:tc>
+      </w:tr>
+      <w:tr>
+        <w:tc>
+          <w:tcPr>
+            <w:tcW w:type="dxa" w:w="4248"/>
+            <w:tcMar>
+              <w:top w:type="dxa" w:w="60"/>
+              <w:left w:type="dxa" w:w="90"/>
+              <w:bottom w:type="dxa" w:w="60"/>
+              <w:right w:type="dxa" w:w="90"/>
+            </w:tcMar>
+          </w:tcPr>
+          <w:p>
+            <w:pPr>
+              <w:spacing w:after="0" w:line="240"/>
+              <w:jc w:val="left"/>
+            </w:pPr>
+            <w:r>
+              <w:rPr>
+                <w:rFonts w:ascii="Calibri" w:cs="Calibri" w:eastAsia="Calibri" w:hAnsi="Calibri"/>
+                <w:b w:val="false"/>
+                <w:bCs w:val="false"/>
+                <w:sz w:val="19"/>
+                <w:szCs w:val="19"/>
+              </w:rPr>
+              <w:t xml:space="preserve">Cellular, study area</w:t>
+            </w:r>
+          </w:p>
+        </w:tc>
+        <w:tc>
+          <w:tcPr>
+            <w:tcW w:type="dxa" w:w="1593"/>
+            <w:tcMar>
+              <w:top w:type="dxa" w:w="60"/>
+              <w:left w:type="dxa" w:w="90"/>
+              <w:bottom w:type="dxa" w:w="60"/>
+              <w:right w:type="dxa" w:w="90"/>
+            </w:tcMar>
+          </w:tcPr>
+          <w:p>
+            <w:pPr>
+              <w:spacing w:after="0" w:line="240"/>
+              <w:jc w:val="right"/>
+            </w:pPr>
+            <w:r>
+              <w:rPr>
+                <w:rFonts w:ascii="Calibri" w:cs="Calibri" w:eastAsia="Calibri" w:hAnsi="Calibri"/>
+                <w:b w:val="false"/>
+                <w:bCs w:val="false"/>
+                <w:sz w:val="19"/>
+                <w:szCs w:val="19"/>
+              </w:rPr>
+              <w:t xml:space="preserve">25 %</w:t>
+            </w:r>
+          </w:p>
+        </w:tc>
+        <w:tc>
+          <w:tcPr>
+            <w:tcW w:type="dxa" w:w="1593"/>
+            <w:tcMar>
+              <w:top w:type="dxa" w:w="60"/>
+              <w:left w:type="dxa" w:w="90"/>
+              <w:bottom w:type="dxa" w:w="60"/>
+              <w:right w:type="dxa" w:w="90"/>
+            </w:tcMar>
+          </w:tcPr>
+          <w:p>
+            <w:pPr>
+              <w:spacing w:after="0" w:line="240"/>
+              <w:jc w:val="right"/>
+            </w:pPr>
+            <w:r>
+              <w:rPr>
+                <w:rFonts w:ascii="Calibri" w:cs="Calibri" w:eastAsia="Calibri" w:hAnsi="Calibri"/>
+                <w:b w:val="false"/>
+                <w:bCs w:val="false"/>
+                <w:sz w:val="19"/>
+                <w:szCs w:val="19"/>
+              </w:rPr>
+              <w:t xml:space="preserve">40 %</w:t>
+            </w:r>
+          </w:p>
+        </w:tc>
+        <w:tc>
+          <w:tcPr>
+            <w:tcW w:type="dxa" w:w="1593"/>
+            <w:tcMar>
+              <w:top w:type="dxa" w:w="60"/>
+              <w:left w:type="dxa" w:w="90"/>
+              <w:bottom w:type="dxa" w:w="60"/>
+              <w:right w:type="dxa" w:w="90"/>
+            </w:tcMar>
+          </w:tcPr>
+          <w:p>
+            <w:pPr>
+              <w:spacing w:after="0" w:line="240"/>
+              <w:jc w:val="right"/>
+            </w:pPr>
+            <w:r>
+              <w:rPr>
+                <w:rFonts w:ascii="Calibri" w:cs="Calibri" w:eastAsia="Calibri" w:hAnsi="Calibri"/>
+                <w:b w:val="false"/>
+                <w:bCs w:val="false"/>
+                <w:sz w:val="19"/>
+                <w:szCs w:val="19"/>
+              </w:rPr>
+              <w:t xml:space="preserve">36 %</w:t>
+            </w:r>
+          </w:p>
+        </w:tc>
+      </w:tr>
+      <w:tr>
+        <w:tc>
+          <w:tcPr>
+            <w:tcW w:type="dxa" w:w="4248"/>
+            <w:tcMar>
+              <w:top w:type="dxa" w:w="60"/>
+              <w:left w:type="dxa" w:w="90"/>
+              <w:bottom w:type="dxa" w:w="60"/>
+              <w:right w:type="dxa" w:w="90"/>
+            </w:tcMar>
+          </w:tcPr>
+          <w:p>
+            <w:pPr>
+              <w:spacing w:after="0" w:line="240"/>
+              <w:jc w:val="left"/>
+            </w:pPr>
+            <w:r>
+              <w:rPr>
+                <w:rFonts w:ascii="Calibri" w:cs="Calibri" w:eastAsia="Calibri" w:hAnsi="Calibri"/>
+                <w:b w:val="false"/>
+                <w:bCs w:val="false"/>
+                <w:sz w:val="19"/>
+                <w:szCs w:val="19"/>
+              </w:rPr>
+              <w:t xml:space="preserve">RavKav bus journeys, start hour</w:t>
+            </w:r>
+          </w:p>
+        </w:tc>
+        <w:tc>
+          <w:tcPr>
+            <w:tcW w:type="dxa" w:w="1593"/>
+            <w:tcMar>
+              <w:top w:type="dxa" w:w="60"/>
+              <w:left w:type="dxa" w:w="90"/>
+              <w:bottom w:type="dxa" w:w="60"/>
+              <w:right w:type="dxa" w:w="90"/>
+            </w:tcMar>
+          </w:tcPr>
+          <w:p>
+            <w:pPr>
+              <w:spacing w:after="0" w:line="240"/>
+              <w:jc w:val="right"/>
+            </w:pPr>
+            <w:r>
+              <w:rPr>
+                <w:rFonts w:ascii="Calibri" w:cs="Calibri" w:eastAsia="Calibri" w:hAnsi="Calibri"/>
+                <w:b w:val="false"/>
+                <w:bCs w:val="false"/>
+                <w:sz w:val="19"/>
+                <w:szCs w:val="19"/>
+              </w:rPr>
+              <w:t xml:space="preserve">18 %</w:t>
+            </w:r>
+          </w:p>
+        </w:tc>
+        <w:tc>
+          <w:tcPr>
+            <w:tcW w:type="dxa" w:w="1593"/>
+            <w:tcMar>
+              <w:top w:type="dxa" w:w="60"/>
+              <w:left w:type="dxa" w:w="90"/>
+              <w:bottom w:type="dxa" w:w="60"/>
+              <w:right w:type="dxa" w:w="90"/>
+            </w:tcMar>
+          </w:tcPr>
+          <w:p>
+            <w:pPr>
+              <w:spacing w:after="0" w:line="240"/>
+              <w:jc w:val="right"/>
+            </w:pPr>
+            <w:r>
+              <w:rPr>
+                <w:rFonts w:ascii="Calibri" w:cs="Calibri" w:eastAsia="Calibri" w:hAnsi="Calibri"/>
+                <w:b w:val="false"/>
+                <w:bCs w:val="false"/>
+                <w:sz w:val="19"/>
+                <w:szCs w:val="19"/>
+              </w:rPr>
+              <w:t xml:space="preserve">41 %</w:t>
+            </w:r>
+          </w:p>
+        </w:tc>
+        <w:tc>
+          <w:tcPr>
+            <w:tcW w:type="dxa" w:w="1593"/>
+            <w:tcMar>
+              <w:top w:type="dxa" w:w="60"/>
+              <w:left w:type="dxa" w:w="90"/>
+              <w:bottom w:type="dxa" w:w="60"/>
+              <w:right w:type="dxa" w:w="90"/>
+            </w:tcMar>
+          </w:tcPr>
+          <w:p>
+            <w:pPr>
+              <w:spacing w:after="0" w:line="240"/>
+              <w:jc w:val="right"/>
+            </w:pPr>
+            <w:r>
+              <w:rPr>
+                <w:rFonts w:ascii="Calibri" w:cs="Calibri" w:eastAsia="Calibri" w:hAnsi="Calibri"/>
+                <w:b w:val="false"/>
+                <w:bCs w:val="false"/>
+                <w:sz w:val="19"/>
+                <w:szCs w:val="19"/>
+              </w:rPr>
+              <w:t xml:space="preserve">41 %</w:t>
+            </w:r>
+          </w:p>
+        </w:tc>
+      </w:tr>
+    </w:tbl>
+    <w:p>
+      <w:pPr>
+        <w:spacing w:after="200" w:before="60"/>
+        <w:jc w:val="center"/>
+      </w:pPr>
+      <w:r>
+        <w:rPr>
+          <w:rFonts w:ascii="Calibri" w:cs="Calibri" w:eastAsia="Calibri" w:hAnsi="Calibri"/>
+          <w:i/>
+          <w:iCs/>
+          <w:color w:val="52514e"/>
+          <w:sz w:val="18"/>
+          <w:szCs w:val="18"/>
+        </w:rPr>
+        <w:t xml:space="preserve">Share of the 6:00–9:00 trips in each hour.</w:t>
+      </w:r>
+    </w:p>
+    <w:p>
+      <w:pPr>
+        <w:spacing w:after="120" w:line="276"/>
+      </w:pPr>
+      <w:r>
+        <w:rPr>
+          <w:rFonts w:ascii="Calibri" w:cs="Calibri" w:eastAsia="Calibri" w:hAnsi="Calibri"/>
+          <w:sz w:val="22"/>
+          <w:szCs w:val="22"/>
+        </w:rPr>
+        <w:t xml:space="preserve">Recommendation: report the peak hour (7:00–8:00) as 40 % of the three-hour matrix, the share the two measured sources agree on, which is 1.2 times the average hour. LRT loading and capacity are set by the busiest hour, so the peak hour is the figure to show, with the average hour alongside if a conservative figure is wanted. The survey's own 66 % is almost certainly reporting rounded to "7:00" and should not be used as a peak factor. One caution: a departure-hour peak is not a link-loading peak; long trips leaving at 7:00 cross the Haifa segment after 7:30, and a strict loading by hour would need hourly matrices routed with travel times.</w:t>
       </w:r>
     </w:p>
     <w:p>
@@ -11443,7 +14753,215 @@
         <w:rPr>
           <w:rFonts w:ascii="Calibri" w:cs="Calibri" w:eastAsia="Calibri" w:hAnsi="Calibri"/>
         </w:rPr>
-        <w:t xml:space="preserve">8. Files</w:t>
+        <w:t xml:space="preserve">9. What to keep in mind</w:t>
+      </w:r>
+    </w:p>
+    <w:p>
+      <w:pPr>
+        <w:pStyle w:val="ListParagraph"/>
+        <w:numPr>
+          <w:ilvl w:val="0"/>
+          <w:numId w:val="2"/>
+        </w:numPr>
+        <w:spacing w:after="80" w:line="276"/>
+      </w:pPr>
+      <w:r>
+        <w:rPr>
+          <w:rFonts w:ascii="Calibri" w:cs="Calibri" w:eastAsia="Calibri" w:hAnsi="Calibri"/>
+          <w:b/>
+          <w:bCs/>
+          <w:sz w:val="22"/>
+          <w:szCs w:val="22"/>
+        </w:rPr>
+        <w:t xml:space="preserve">Two frames. </w:t>
+      </w:r>
+      <w:r>
+        <w:rPr>
+          <w:rFonts w:ascii="Calibri" w:cs="Calibri" w:eastAsia="Calibri" w:hAnsi="Calibri"/>
+          <w:sz w:val="22"/>
+          <w:szCs w:val="22"/>
+        </w:rPr>
+        <w:t xml:space="preserve">Ticketing journeys start at the boarding stop and include non-residents; survey trips start at the front door and cover residents. At superzone level the two mostly coincide, except at transfer hubs. The calibrated volumes are right for corridor loadings and slightly too concentrated for door-to-door demand at the hubs.</w:t>
+      </w:r>
+    </w:p>
+    <w:p>
+      <w:pPr>
+        <w:pStyle w:val="ListParagraph"/>
+        <w:numPr>
+          <w:ilvl w:val="0"/>
+          <w:numId w:val="2"/>
+        </w:numPr>
+        <w:spacing w:after="80" w:line="276"/>
+      </w:pPr>
+      <w:r>
+        <w:rPr>
+          <w:rFonts w:ascii="Calibri" w:cs="Calibri" w:eastAsia="Calibri" w:hAnsi="Calibri"/>
+          <w:b/>
+          <w:bCs/>
+          <w:sz w:val="22"/>
+          <w:szCs w:val="22"/>
+        </w:rPr>
+        <w:t xml:space="preserve">Ticketing coverage. </w:t>
+      </w:r>
+      <w:r>
+        <w:rPr>
+          <w:rFonts w:ascii="Calibri" w:cs="Calibri" w:eastAsia="Calibri" w:hAnsi="Calibri"/>
+          <w:sz w:val="22"/>
+          <w:szCs w:val="22"/>
+        </w:rPr>
+        <w:t xml:space="preserve">The ticketing extract under-records local bus travel in the Arab-sector and peripheral superzones while covering their intercity trips reasonably well. The coverage rule should be applied separately to local and inter-superzone trips (not yet done), and the provider should confirm which operators and fare types the extract covers.</w:t>
+      </w:r>
+    </w:p>
+    <w:p>
+      <w:pPr>
+        <w:pStyle w:val="ListParagraph"/>
+        <w:numPr>
+          <w:ilvl w:val="0"/>
+          <w:numId w:val="2"/>
+        </w:numPr>
+        <w:spacing w:after="80" w:line="276"/>
+      </w:pPr>
+      <w:r>
+        <w:rPr>
+          <w:rFonts w:ascii="Calibri" w:cs="Calibri" w:eastAsia="Calibri" w:hAnsi="Calibri"/>
+          <w:b/>
+          <w:bCs/>
+          <w:sz w:val="22"/>
+          <w:szCs w:val="22"/>
+        </w:rPr>
+        <w:t xml:space="preserve">Hubs in the profiles. </w:t>
+      </w:r>
+      <w:r>
+        <w:rPr>
+          <w:rFonts w:ascii="Calibri" w:cs="Calibri" w:eastAsia="Calibri" w:hAnsi="Calibri"/>
+          <w:sz w:val="22"/>
+          <w:szCs w:val="22"/>
+        </w:rPr>
+        <w:t xml:space="preserve">Ticketing journeys begin at the boarding stop, so transfer hubs such as Hamifrats and Neve Yosef collect journeys that the survey attributes to the traveller's home area. The ticketing profile is right for corridor loadings at the hubs; the survey-based profile is right for where demand originates.</w:t>
+      </w:r>
+    </w:p>
+    <w:p>
+      <w:pPr>
+        <w:pStyle w:val="ListParagraph"/>
+        <w:numPr>
+          <w:ilvl w:val="0"/>
+          <w:numId w:val="2"/>
+        </w:numPr>
+        <w:spacing w:after="80" w:line="276"/>
+      </w:pPr>
+      <w:r>
+        <w:rPr>
+          <w:rFonts w:ascii="Calibri" w:cs="Calibri" w:eastAsia="Calibri" w:hAnsi="Calibri"/>
+          <w:b/>
+          <w:bCs/>
+          <w:sz w:val="22"/>
+          <w:szCs w:val="22"/>
+        </w:rPr>
+        <w:t xml:space="preserve">Trip rates are frozen. </w:t>
+      </w:r>
+      <w:r>
+        <w:rPr>
+          <w:rFonts w:ascii="Calibri" w:cs="Calibri" w:eastAsia="Calibri" w:hAnsi="Calibri"/>
+          <w:sz w:val="22"/>
+          <w:szCs w:val="22"/>
+        </w:rPr>
+        <w:t xml:space="preserve">Growth to 2022 keeps 2018 trip rates and uses a forecast, not observed 2022 data. Changes in age structure, car ownership or working from home are not represented. Screenline counts (task B1) would be the natural check for the car layer.</w:t>
+      </w:r>
+    </w:p>
+    <w:p>
+      <w:pPr>
+        <w:pStyle w:val="ListParagraph"/>
+        <w:numPr>
+          <w:ilvl w:val="0"/>
+          <w:numId w:val="2"/>
+        </w:numPr>
+        <w:spacing w:after="80" w:line="276"/>
+      </w:pPr>
+      <w:r>
+        <w:rPr>
+          <w:rFonts w:ascii="Calibri" w:cs="Calibri" w:eastAsia="Calibri" w:hAnsi="Calibri"/>
+          <w:b/>
+          <w:bCs/>
+          <w:sz w:val="22"/>
+          <w:szCs w:val="22"/>
+        </w:rPr>
+        <w:t xml:space="preserve">TAZ detail is synthetic. </w:t>
+      </w:r>
+      <w:r>
+        <w:rPr>
+          <w:rFonts w:ascii="Calibri" w:cs="Calibri" w:eastAsia="Calibri" w:hAnsi="Calibri"/>
+          <w:sz w:val="22"/>
+          <w:szCs w:val="22"/>
+        </w:rPr>
+        <w:t xml:space="preserve">Below the 1,250-zone level the survey's TAZ detail is a population / employment split; for the cellular matrix it is a replication of coarse zones. TAZ-level agreement between them is flattered by construction; superzones and sub-areas are the fair level.</w:t>
+      </w:r>
+    </w:p>
+    <w:p>
+      <w:pPr>
+        <w:pStyle w:val="ListParagraph"/>
+        <w:numPr>
+          <w:ilvl w:val="0"/>
+          <w:numId w:val="2"/>
+        </w:numPr>
+        <w:spacing w:after="80" w:line="276"/>
+      </w:pPr>
+      <w:r>
+        <w:rPr>
+          <w:rFonts w:ascii="Calibri" w:cs="Calibri" w:eastAsia="Calibri" w:hAnsi="Calibri"/>
+          <w:b/>
+          <w:bCs/>
+          <w:sz w:val="22"/>
+          <w:szCs w:val="22"/>
+        </w:rPr>
+        <w:t xml:space="preserve">Rail is thin. </w:t>
+      </w:r>
+      <w:r>
+        <w:rPr>
+          <w:rFonts w:ascii="Calibri" w:cs="Calibri" w:eastAsia="Calibri" w:hAnsi="Calibri"/>
+          <w:sz w:val="22"/>
+          <w:szCs w:val="22"/>
+        </w:rPr>
+        <w:t xml:space="preserve">54 observed rail trips over two days make the survey rail matrix a rough sketch. Use the station-based smartcard matrix where station origins are acceptable.</w:t>
+      </w:r>
+    </w:p>
+    <w:p>
+      <w:pPr>
+        <w:pStyle w:val="ListParagraph"/>
+        <w:numPr>
+          <w:ilvl w:val="0"/>
+          <w:numId w:val="2"/>
+        </w:numPr>
+        <w:spacing w:after="80" w:line="276"/>
+      </w:pPr>
+      <w:r>
+        <w:rPr>
+          <w:rFonts w:ascii="Calibri" w:cs="Calibri" w:eastAsia="Calibri" w:hAnsi="Calibri"/>
+          <w:b/>
+          <w:bCs/>
+          <w:sz w:val="22"/>
+          <w:szCs w:val="22"/>
+        </w:rPr>
+        <w:t xml:space="preserve">Cellular volumes. </w:t>
+      </w:r>
+      <w:r>
+        <w:rPr>
+          <w:rFonts w:ascii="Calibri" w:cs="Calibri" w:eastAsia="Calibri" w:hAnsi="Calibri"/>
+          <w:sz w:val="22"/>
+          <w:szCs w:val="22"/>
+        </w:rPr>
+        <w:t xml:space="preserve">The cellular product records 3.6 times fewer morning trips than the survey expansion and misses short trips in particular. Its trip definition (dwell time, minimum distance) is needed before it can anchor volumes anywhere.</w:t>
+      </w:r>
+    </w:p>
+    <w:p>
+      <w:pPr>
+        <w:pStyle w:val="Heading1"/>
+        <w:spacing w:after="160" w:before="360"/>
+      </w:pPr>
+      <w:r>
+        <w:rPr>
+          <w:rFonts w:ascii="Calibri" w:cs="Calibri" w:eastAsia="Calibri" w:hAnsi="Calibri"/>
+        </w:rPr>
+        <w:t xml:space="preserve">10. Files</w:t>
       </w:r>
     </w:p>
     <w:tbl>
@@ -11967,6 +15485,255 @@
           </w:p>
         </w:tc>
       </w:tr>
+      <w:tr>
+        <w:tc>
+          <w:tcPr>
+            <w:tcW w:type="dxa" w:w="2608"/>
+            <w:tcMar>
+              <w:top w:type="dxa" w:w="60"/>
+              <w:left w:type="dxa" w:w="90"/>
+              <w:bottom w:type="dxa" w:w="60"/>
+              <w:right w:type="dxa" w:w="90"/>
+            </w:tcMar>
+          </w:tcPr>
+          <w:p>
+            <w:pPr>
+              <w:spacing w:after="0" w:line="240"/>
+              <w:jc w:val="left"/>
+            </w:pPr>
+            <w:r>
+              <w:rPr>
+                <w:rFonts w:ascii="Calibri" w:cs="Calibri" w:eastAsia="Calibri" w:hAnsi="Calibri"/>
+                <w:b w:val="false"/>
+                <w:bCs w:val="false"/>
+                <w:sz w:val="18"/>
+                <w:szCs w:val="18"/>
+              </w:rPr>
+              <w:t xml:space="preserve">Corridor_flow_profile_survey_2022.ipynb</w:t>
+            </w:r>
+          </w:p>
+        </w:tc>
+        <w:tc>
+          <w:tcPr>
+            <w:tcW w:type="dxa" w:w="3209"/>
+            <w:tcMar>
+              <w:top w:type="dxa" w:w="60"/>
+              <w:left w:type="dxa" w:w="90"/>
+              <w:bottom w:type="dxa" w:w="60"/>
+              <w:right w:type="dxa" w:w="90"/>
+            </w:tcMar>
+          </w:tcPr>
+          <w:p>
+            <w:pPr>
+              <w:spacing w:after="0" w:line="240"/>
+              <w:jc w:val="left"/>
+            </w:pPr>
+            <w:r>
+              <w:rPr>
+                <w:rFonts w:ascii="Calibri" w:cs="Calibri" w:eastAsia="Calibri" w:hAnsi="Calibri"/>
+                <w:b w:val="false"/>
+                <w:bCs w:val="false"/>
+                <w:sz w:val="18"/>
+                <w:szCs w:val="18"/>
+              </w:rPr>
+              <w:t xml:space="preserve">Directional link-flow profiles, total and transit</w:t>
+            </w:r>
+          </w:p>
+        </w:tc>
+        <w:tc>
+          <w:tcPr>
+            <w:tcW w:type="dxa" w:w="3209"/>
+            <w:tcMar>
+              <w:top w:type="dxa" w:w="60"/>
+              <w:left w:type="dxa" w:w="90"/>
+              <w:bottom w:type="dxa" w:w="60"/>
+              <w:right w:type="dxa" w:w="90"/>
+            </w:tcMar>
+          </w:tcPr>
+          <w:p>
+            <w:pPr>
+              <w:spacing w:after="0" w:line="240"/>
+              <w:jc w:val="left"/>
+            </w:pPr>
+            <w:r>
+              <w:rPr>
+                <w:rFonts w:ascii="Calibri" w:cs="Calibri" w:eastAsia="Calibri" w:hAnsi="Calibri"/>
+                <w:b w:val="false"/>
+                <w:bCs w:val="false"/>
+                <w:sz w:val="18"/>
+                <w:szCs w:val="18"/>
+              </w:rPr>
+              <w:t xml:space="preserve">Output/ths2017/three_mode_2022/corridor_link_flows_{total,transit}_2022.csv; figures corridor_flow_profile_*_survey2022.png</w:t>
+            </w:r>
+          </w:p>
+        </w:tc>
+      </w:tr>
+      <w:tr>
+        <w:tc>
+          <w:tcPr>
+            <w:tcW w:type="dxa" w:w="2608"/>
+            <w:tcMar>
+              <w:top w:type="dxa" w:w="60"/>
+              <w:left w:type="dxa" w:w="90"/>
+              <w:bottom w:type="dxa" w:w="60"/>
+              <w:right w:type="dxa" w:w="90"/>
+            </w:tcMar>
+          </w:tcPr>
+          <w:p>
+            <w:pPr>
+              <w:spacing w:after="0" w:line="240"/>
+              <w:jc w:val="left"/>
+            </w:pPr>
+            <w:r>
+              <w:rPr>
+                <w:rFonts w:ascii="Calibri" w:cs="Calibri" w:eastAsia="Calibri" w:hAnsi="Calibri"/>
+                <w:b w:val="false"/>
+                <w:bCs w:val="false"/>
+                <w:sz w:val="18"/>
+                <w:szCs w:val="18"/>
+              </w:rPr>
+              <w:t xml:space="preserve">Corridor_profile_hybrid_vs_ticketing.ipynb</w:t>
+            </w:r>
+          </w:p>
+        </w:tc>
+        <w:tc>
+          <w:tcPr>
+            <w:tcW w:type="dxa" w:w="3209"/>
+            <w:tcMar>
+              <w:top w:type="dxa" w:w="60"/>
+              <w:left w:type="dxa" w:w="90"/>
+              <w:bottom w:type="dxa" w:w="60"/>
+              <w:right w:type="dxa" w:w="90"/>
+            </w:tcMar>
+          </w:tcPr>
+          <w:p>
+            <w:pPr>
+              <w:spacing w:after="0" w:line="240"/>
+              <w:jc w:val="left"/>
+            </w:pPr>
+            <w:r>
+              <w:rPr>
+                <w:rFonts w:ascii="Calibri" w:cs="Calibri" w:eastAsia="Calibri" w:hAnsi="Calibri"/>
+                <w:b w:val="false"/>
+                <w:bCs w:val="false"/>
+                <w:sz w:val="18"/>
+                <w:szCs w:val="18"/>
+              </w:rPr>
+              <w:t xml:space="preserve">Calibrated survey vs ticketing profiles; local-vs-intercity coverage split</w:t>
+            </w:r>
+          </w:p>
+        </w:tc>
+        <w:tc>
+          <w:tcPr>
+            <w:tcW w:type="dxa" w:w="3209"/>
+            <w:tcMar>
+              <w:top w:type="dxa" w:w="60"/>
+              <w:left w:type="dxa" w:w="90"/>
+              <w:bottom w:type="dxa" w:w="60"/>
+              <w:right w:type="dxa" w:w="90"/>
+            </w:tcMar>
+          </w:tcPr>
+          <w:p>
+            <w:pPr>
+              <w:spacing w:after="0" w:line="240"/>
+              <w:jc w:val="left"/>
+            </w:pPr>
+            <w:r>
+              <w:rPr>
+                <w:rFonts w:ascii="Calibri" w:cs="Calibri" w:eastAsia="Calibri" w:hAnsi="Calibri"/>
+                <w:b w:val="false"/>
+                <w:bCs w:val="false"/>
+                <w:sz w:val="18"/>
+                <w:szCs w:val="18"/>
+              </w:rPr>
+              <w:t xml:space="preserve">Output/ths2017/three_mode_2022/corridor_profile_*.csv; figures corridor_profile_hybrid_vs_ticketing.png, corridor_profile_transit_share.png</w:t>
+            </w:r>
+          </w:p>
+        </w:tc>
+      </w:tr>
+      <w:tr>
+        <w:tc>
+          <w:tcPr>
+            <w:tcW w:type="dxa" w:w="2608"/>
+            <w:tcMar>
+              <w:top w:type="dxa" w:w="60"/>
+              <w:left w:type="dxa" w:w="90"/>
+              <w:bottom w:type="dxa" w:w="60"/>
+              <w:right w:type="dxa" w:w="90"/>
+            </w:tcMar>
+          </w:tcPr>
+          <w:p>
+            <w:pPr>
+              <w:spacing w:after="0" w:line="240"/>
+              <w:jc w:val="left"/>
+            </w:pPr>
+            <w:r>
+              <w:rPr>
+                <w:rFonts w:ascii="Calibri" w:cs="Calibri" w:eastAsia="Calibri" w:hAnsi="Calibri"/>
+                <w:b w:val="false"/>
+                <w:bCs w:val="false"/>
+                <w:sz w:val="18"/>
+                <w:szCs w:val="18"/>
+              </w:rPr>
+              <w:t xml:space="preserve">Corridor_profile_hybrid_vs_survey_tests.ipynb</w:t>
+            </w:r>
+          </w:p>
+        </w:tc>
+        <w:tc>
+          <w:tcPr>
+            <w:tcW w:type="dxa" w:w="3209"/>
+            <w:tcMar>
+              <w:top w:type="dxa" w:w="60"/>
+              <w:left w:type="dxa" w:w="90"/>
+              <w:bottom w:type="dxa" w:w="60"/>
+              <w:right w:type="dxa" w:w="90"/>
+            </w:tcMar>
+          </w:tcPr>
+          <w:p>
+            <w:pPr>
+              <w:spacing w:after="0" w:line="240"/>
+              <w:jc w:val="left"/>
+            </w:pPr>
+            <w:r>
+              <w:rPr>
+                <w:rFonts w:ascii="Calibri" w:cs="Calibri" w:eastAsia="Calibri" w:hAnsi="Calibri"/>
+                <w:b w:val="false"/>
+                <w:bCs w:val="false"/>
+                <w:sz w:val="18"/>
+                <w:szCs w:val="18"/>
+              </w:rPr>
+              <w:t xml:space="preserve">GEH per link and shape D, cellular hybrid vs survey-only, 2018</w:t>
+            </w:r>
+          </w:p>
+        </w:tc>
+        <w:tc>
+          <w:tcPr>
+            <w:tcW w:type="dxa" w:w="3209"/>
+            <w:tcMar>
+              <w:top w:type="dxa" w:w="60"/>
+              <w:left w:type="dxa" w:w="90"/>
+              <w:bottom w:type="dxa" w:w="60"/>
+              <w:right w:type="dxa" w:w="90"/>
+            </w:tcMar>
+          </w:tcPr>
+          <w:p>
+            <w:pPr>
+              <w:spacing w:after="0" w:line="240"/>
+              <w:jc w:val="left"/>
+            </w:pPr>
+            <w:r>
+              <w:rPr>
+                <w:rFonts w:ascii="Calibri" w:cs="Calibri" w:eastAsia="Calibri" w:hAnsi="Calibri"/>
+                <w:b w:val="false"/>
+                <w:bCs w:val="false"/>
+                <w:sz w:val="18"/>
+                <w:szCs w:val="18"/>
+              </w:rPr>
+              <w:t xml:space="preserve">Output/ths2017/tests/corridor_profile_hybrid_vs_survey_*.csv; figures corridor_profile_hybrid_vs_survey*.png</w:t>
+            </w:r>
+          </w:p>
+        </w:tc>
+      </w:tr>
     </w:tbl>
     <w:p>
       <w:pPr>
@@ -11983,7 +15750,7 @@
           <w:sz w:val="22"/>
           <w:szCs w:val="22"/>
         </w:rPr>
-        <w:t xml:space="preserve">Full method details, with every number, are in METHODOLOGY.md sections 6j to 6n of the repository.</w:t>
+        <w:t xml:space="preserve">Full method details, with every number, are in METHODOLOGY.md sections 6j to 6q of the repository.</w:t>
       </w:r>
     </w:p>
     <w:sectPr>

</xml_diff>